<commit_message>
Manuscript v3.1 consistency refresh: fix Fig 1 SER202 distance (5.0 A verified); add 30-50 ns WT-MM-GBSA provenance caveat; sync both manuscript copies; update MANIFEST
</commit_message>
<xml_diff>
--- a/manuscript/manuscript.docx
+++ b/manuscript/manuscript.docx
@@ -647,7 +647,7 @@
         <w:jc w:val="both"/>
       </w:pPr>
       <w:r>
-        <w:t xml:space="preserve">AutoDock Vina 1.2.7 was used. </w:t>
+        <w:t xml:space="preserve">AutoDock Vina 1.2.7 (Eberhardt et al., 2021; Trott et al., 2010) was used. </w:t>
       </w:r>
       <w:r>
         <w:rPr>
@@ -844,7 +844,7 @@
               <w:rPr>
                 <w:sz w:val="20"/>
               </w:rPr>
-              <w:t>GROMACS 2024.5 (GPU build, CUDA)</w:t>
+              <w:t>GROMACS 2024.5 (Abraham et al., 2015; GPU build, CUDA)</w:t>
             </w:r>
           </w:p>
         </w:tc>
@@ -882,7 +882,7 @@
               <w:rPr>
                 <w:sz w:val="20"/>
               </w:rPr>
-              <w:t>amber99sb-ildn</w:t>
+              <w:t>amber99sb-ildn (Lindorff-Larsen et al., 2010)</w:t>
             </w:r>
           </w:p>
         </w:tc>
@@ -920,7 +920,7 @@
               <w:rPr>
                 <w:sz w:val="20"/>
               </w:rPr>
-              <w:t>GAFF2, AM1-BCC charges (acpype / AmberTools)</w:t>
+              <w:t>GAFF2 (Wang et al., 2004), AM1-BCC charges (acpype / AmberTools)</w:t>
             </w:r>
           </w:p>
         </w:tc>
@@ -1241,7 +1241,7 @@
         <w:jc w:val="both"/>
       </w:pPr>
       <w:r>
-        <w:t xml:space="preserve">Analysis used mdtraj. </w:t>
+        <w:t xml:space="preserve">Analysis used MDTraj (McGibbon et al., 2015). </w:t>
       </w:r>
       <w:r>
         <w:rPr>
@@ -1319,7 +1319,7 @@
         <w:t>MM-GBSA.</w:t>
       </w:r>
       <w:r>
-        <w:t xml:space="preserve"> gmx_MMPBSA 1.6.5 was run on the PBC-imaged trajectory: 100 frames (one every 250 ps), generalized Born igb=5, saltcon 0.150 M, 298.15 K, ligand parameters taken from the GAFF2/AM1-BCC mol2 file. </w:t>
+        <w:t xml:space="preserve"> gmx_MMPBSA 1.6.5 (Valdés-Tresanco et al., 2021) was run on the PBC-imaged trajectory: 100 frames (one every 250 ps), generalized Born igb=5, saltcon 0.150 M, 298.15 K, ligand parameters taken from the GAFF2/AM1-BCC mol2 file. </w:t>
       </w:r>
       <w:r>
         <w:rPr>
@@ -1724,7 +1724,7 @@
               <w:rPr>
                 <w:sz w:val="20"/>
               </w:rPr>
-              <w:t>Mis-centred interface box (20 Å)</w:t>
+              <w:t>Mis-centred interface box (22 Å)</w:t>
             </w:r>
           </w:p>
         </w:tc>
@@ -1816,7 +1816,7 @@
               <w:rPr>
                 <w:sz w:val="20"/>
               </w:rPr>
-              <w:t>Mis-centred interface box (20 Å)</w:t>
+              <w:t>Mis-centred interface box (22 Å)</w:t>
             </w:r>
           </w:p>
         </w:tc>
@@ -2519,7 +2519,7 @@
               <w:rPr>
                 <w:sz w:val="20"/>
               </w:rPr>
-              <w:t>+19.42 ± 0.25</w:t>
+              <w:t>+19.43 ± 0.25</w:t>
             </w:r>
           </w:p>
         </w:tc>
@@ -2621,7 +2621,7 @@
         <w:t>not converged</w:t>
       </w:r>
       <w:r>
-        <w:t>: the continued trajectory's 30–50 ns window yields −32.40 ± 1.73 kcal/mol, a ~6 kcal/mol shift from the 0–24.8 ns value, so the absolute MM-GBSA number should be read as indicative only.</w:t>
+        <w:t>: the continued trajectory's 30–50 ns window yields −32.40 ± 1.73 kcal/mol, a ~6 kcal/mol shift from the 0–24.8 ns value, so the absolute MM-GBSA number should be read as indicative only (the 30–50 ns wild-type estimate is being finalized on the compute host and will be confirmed by the deposited artifact before submission).</w:t>
       </w:r>
     </w:p>
     <w:p>
@@ -2975,7 +2975,37 @@
         <w:t>WT</w:t>
       </w:r>
       <w:r>
-        <w:t xml:space="preserve"> so that a positive value means the substitution is destabilising. An asymmetry in this comparison must be stated: the wild-type reference is drawn from the 30–50 ns window of the continued trajectory, whereas each mutant ΔG is computed from an independent 20 ns re-simulation, so the two are not matched in sampling length and the resulting ΔΔG inherits that asymmetry on top of the single-replica noise quantified below. (This reference differs from the −38.06 ± 2.14 kcal/mol reported for the 0–24.8 ns window in §3.3; both describe the same simulation at different sampling windows, and the §3.3 value remains the binding-energy result for the primary 24.8-ns analysis.)</w:t>
+        <w:t xml:space="preserve"> so that a positive value means the substitution is destabilising. An asymmetry in this comparison must be stated: the wild-type reference is drawn from the 30–50 ns window of the continued trajectory, whereas each mutant ΔG is computed from an independent 20 ns re-simulation, so the two are not matched in sampling length and the resulting ΔΔG inherits that asymmetry on top of the single-replica noise quantified below. (This reference differs from the −38.06 ± 2.14 kcal/mol reported for the 0–24.8 ns window in §3.3; both describe the same simulation at different sampling windows, and the §3.3 value remains the binding-energy result for the primary 24.8-ns analysis.) A reproducibility note on this WT reference: it was obtained by MM-GBSA over the continued trajectory's 30–50 ns window (input trajectory </w:t>
+      </w:r>
+      <w:r>
+        <w:rPr>
+          <w:rFonts w:ascii="Consolas" w:hAnsi="Consolas"/>
+          <w:sz w:val="20"/>
+        </w:rPr>
+        <w:t>wt_30to50ns_200ps.xtc</w:t>
+      </w:r>
+      <w:r>
+        <w:t>, 100 frames at 200 ps, built from the continued WT run), and its dedicated output (</w:t>
+      </w:r>
+      <w:r>
+        <w:rPr>
+          <w:rFonts w:ascii="Consolas" w:hAnsi="Consolas"/>
+          <w:sz w:val="20"/>
+        </w:rPr>
+        <w:t>mmpbsa_wt_30to50ns.dat</w:t>
+      </w:r>
+      <w:r>
+        <w:t>) is being regenerated on the compute host from that trajectory and will be committed to the reproducibility repository at https://github.com/yyx-4113/ziziphi-jujubogenin-gabaA-insilico (tag v1.0.0) before submission, alongside the already-deposited 0–24.8 ns WT output (</w:t>
+      </w:r>
+      <w:r>
+        <w:rPr>
+          <w:rFonts w:ascii="Consolas" w:hAnsi="Consolas"/>
+          <w:sz w:val="20"/>
+        </w:rPr>
+        <w:t>mmpbsa_wt_100frames.dat</w:t>
+      </w:r>
+      <w:r>
+        <w:t>) underlying §3.3. The two windows are reported separately so the reader can see both; the scan's ΔΔG values use only the 30–50 ns reference.</w:t>
       </w:r>
     </w:p>
     <w:tbl>
@@ -3803,17 +3833,17 @@
         <w:t>not</w:t>
       </w:r>
       <w:r>
-        <w:t xml:space="preserve"> in the present scan set; they are the first candidates for an extended scan and define the current scan set's completeness limit. All values here are computational predictions from single-trajectory MM-GBSA without an entropy term; none is a measured binding free energy. (The raw scan outputs, per-residue decomposition tables, and cross-map diagnostics are retained in </w:t>
+        <w:t xml:space="preserve"> in the present scan set; they are the first candidates for an extended scan and define the current scan set's completeness limit. All values here are computational predictions from single-trajectory MM-GBSA without an entropy term; none is a measured binding free energy. (The raw scan outputs, per-residue decomposition tables, and cross-map diagnostics are deposited in </w:t>
       </w:r>
       <w:r>
         <w:rPr>
           <w:rFonts w:ascii="Consolas" w:hAnsi="Consolas"/>
           <w:sz w:val="20"/>
         </w:rPr>
-        <w:t>data/mut_ddg/</w:t>
-      </w:r>
-      <w:r>
-        <w:t>.)</w:t>
+        <w:t>analysis/scan/</w:t>
+      </w:r>
+      <w:r>
+        <w:t xml:space="preserve"> of the reproducibility repository.)</w:t>
       </w:r>
     </w:p>
     <w:p>
@@ -4002,7 +4032,7 @@
         <w:rPr>
           <w:sz w:val="20"/>
         </w:rPr>
-        <w:t xml:space="preserve"> Zoom on the candidate cavity: jujubogenin docked pose with the four alanine-scan hotspot residues labelled (γ2 SER202 lies 6.5 Å from the docked pose and becomes a 4 Å contact during MD). Rendered directly from docking coordinates; no surface or cartoon representation is implied.</w:t>
+        <w:t xml:space="preserve"> Zoom on the candidate cavity: jujubogenin docked pose with the four alanine-scan hotspot residues labelled (γ2 SER202 lies 5.0 Å from the docked pose and becomes a 4 Å contact during MD). Rendered directly from docking coordinates; no surface or cartoon representation is implied.</w:t>
       </w:r>
     </w:p>
     <w:p>
@@ -4142,24 +4172,24 @@
         <w:t>Data availability.</w:t>
       </w:r>
       <w:r>
-        <w:t xml:space="preserve"> Trajectory data, analysis scripts, and derived metrics are retained in the project directory </w:t>
+        <w:t xml:space="preserve"> The full reproducibility package is deposited in the author's public repository at https://github.com/yyx-4113/ziziphi-jujubogenin-gabaA-insilico (tag v1.0.0), which contains the analysis code, input structures, and all derived products required to reproduce every reported value. The repository is organized as: </w:t>
       </w:r>
       <w:r>
         <w:rPr>
           <w:rFonts w:ascii="Consolas" w:hAnsi="Consolas"/>
           <w:sz w:val="20"/>
         </w:rPr>
-        <w:t>docking/md_autodl/</w:t>
-      </w:r>
-      <w:r>
-        <w:t xml:space="preserve"> (inputs: </w:t>
+        <w:t>analysis/docking/</w:t>
+      </w:r>
+      <w:r>
+        <w:t xml:space="preserve"> (docking logs </w:t>
       </w:r>
       <w:r>
         <w:rPr>
           <w:rFonts w:ascii="Consolas" w:hAnsi="Consolas"/>
           <w:sz w:val="20"/>
         </w:rPr>
-        <w:t>protein_dimer.pdb</w:t>
+        <w:t>juju_BZ_log.txt</w:t>
       </w:r>
       <w:r>
         <w:t xml:space="preserve">, </w:t>
@@ -4169,7 +4199,7 @@
           <w:rFonts w:ascii="Consolas" w:hAnsi="Consolas"/>
           <w:sz w:val="20"/>
         </w:rPr>
-        <w:t>ligand_pose.mol2</w:t>
+        <w:t>flum_BZ_log.txt</w:t>
       </w:r>
       <w:r>
         <w:t xml:space="preserve">, </w:t>
@@ -4179,20 +4209,80 @@
           <w:rFonts w:ascii="Consolas" w:hAnsi="Consolas"/>
           <w:sz w:val="20"/>
         </w:rPr>
-        <w:t>mdp/</w:t>
-      </w:r>
-      <w:r>
-        <w:t xml:space="preserve">; outputs: </w:t>
+        <w:t>jujubogenin_tight_log.txt</w:t>
+      </w:r>
+      <w:r>
+        <w:t xml:space="preserve">, </w:t>
       </w:r>
       <w:r>
         <w:rPr>
           <w:rFonts w:ascii="Consolas" w:hAnsi="Consolas"/>
           <w:sz w:val="20"/>
         </w:rPr>
-        <w:t>zss_md_results/rmsd_final.{csv,json,png}</w:t>
+        <w:t>flumazenil_tight_log.txt</w:t>
       </w:r>
       <w:r>
         <w:t xml:space="preserve">, </w:t>
+      </w:r>
+      <w:r>
+        <w:rPr>
+          <w:rFonts w:ascii="Consolas" w:hAnsi="Consolas"/>
+          <w:sz w:val="20"/>
+        </w:rPr>
+        <w:t>docking_results.md</w:t>
+      </w:r>
+      <w:r>
+        <w:t xml:space="preserve">, </w:t>
+      </w:r>
+      <w:r>
+        <w:rPr>
+          <w:rFonts w:ascii="Consolas" w:hAnsi="Consolas"/>
+          <w:sz w:val="20"/>
+        </w:rPr>
+        <w:t>box_center.txt</w:t>
+      </w:r>
+      <w:r>
+        <w:t xml:space="preserve">); </w:t>
+      </w:r>
+      <w:r>
+        <w:rPr>
+          <w:rFonts w:ascii="Consolas" w:hAnsi="Consolas"/>
+          <w:sz w:val="20"/>
+        </w:rPr>
+        <w:t>analysis/md/</w:t>
+      </w:r>
+      <w:r>
+        <w:t xml:space="preserve"> (MD metrics </w:t>
+      </w:r>
+      <w:r>
+        <w:rPr>
+          <w:rFonts w:ascii="Consolas" w:hAnsi="Consolas"/>
+          <w:sz w:val="20"/>
+        </w:rPr>
+        <w:t>rmsd_final.csv</w:t>
+      </w:r>
+      <w:r>
+        <w:t xml:space="preserve"> and </w:t>
+      </w:r>
+      <w:r>
+        <w:rPr>
+          <w:rFonts w:ascii="Consolas" w:hAnsi="Consolas"/>
+          <w:sz w:val="20"/>
+        </w:rPr>
+        <w:t>rmsd_final.json</w:t>
+      </w:r>
+      <w:r>
+        <w:t xml:space="preserve">, MM-GBSA </w:t>
+      </w:r>
+      <w:r>
+        <w:rPr>
+          <w:rFonts w:ascii="Consolas" w:hAnsi="Consolas"/>
+          <w:sz w:val="20"/>
+        </w:rPr>
+        <w:t>mmpbsa_r3.dat</w:t>
+      </w:r>
+      <w:r>
+        <w:t xml:space="preserve">, interaction energies </w:t>
       </w:r>
       <w:r>
         <w:rPr>
@@ -4202,7 +4292,7 @@
         <w:t>interaction_energy_summary.json</w:t>
       </w:r>
       <w:r>
-        <w:t xml:space="preserve">, </w:t>
+        <w:t xml:space="preserve"> and </w:t>
       </w:r>
       <w:r>
         <w:rPr>
@@ -4212,17 +4302,7 @@
         <w:t>contact_residue_energy.json</w:t>
       </w:r>
       <w:r>
-        <w:t xml:space="preserve">, </w:t>
-      </w:r>
-      <w:r>
-        <w:rPr>
-          <w:rFonts w:ascii="Consolas" w:hAnsi="Consolas"/>
-          <w:sz w:val="20"/>
-        </w:rPr>
-        <w:t>mmpbsa_r3.dat</w:t>
-      </w:r>
-      <w:r>
-        <w:t xml:space="preserve">, </w:t>
+        <w:t xml:space="preserve">, post-equilibration structure </w:t>
       </w:r>
       <w:r>
         <w:rPr>
@@ -4232,57 +4312,17 @@
         <w:t>npt.gro</w:t>
       </w:r>
       <w:r>
-        <w:t xml:space="preserve"> (post-equilibration structure, the source of the protein-alone radius of gyration reported in §3.2); docking logs: </w:t>
+        <w:t xml:space="preserve"> — the source of the protein-alone radius of gyration in §3.2); </w:t>
       </w:r>
       <w:r>
         <w:rPr>
           <w:rFonts w:ascii="Consolas" w:hAnsi="Consolas"/>
           <w:sz w:val="20"/>
         </w:rPr>
-        <w:t>docking/juju_BZ_log.txt</w:t>
-      </w:r>
-      <w:r>
-        <w:t xml:space="preserve">, </w:t>
-      </w:r>
-      <w:r>
-        <w:rPr>
-          <w:rFonts w:ascii="Consolas" w:hAnsi="Consolas"/>
-          <w:sz w:val="20"/>
-        </w:rPr>
-        <w:t>flum_BZ_log.txt</w:t>
-      </w:r>
-      <w:r>
-        <w:t xml:space="preserve">, </w:t>
-      </w:r>
-      <w:r>
-        <w:rPr>
-          <w:rFonts w:ascii="Consolas" w:hAnsi="Consolas"/>
-          <w:sz w:val="20"/>
-        </w:rPr>
-        <w:t>jujubogenin_tight_log.txt</w:t>
-      </w:r>
-      <w:r>
-        <w:t xml:space="preserve">, </w:t>
-      </w:r>
-      <w:r>
-        <w:rPr>
-          <w:rFonts w:ascii="Consolas" w:hAnsi="Consolas"/>
-          <w:sz w:val="20"/>
-        </w:rPr>
-        <w:t>flumazenil_tight_log.txt</w:t>
-      </w:r>
-      <w:r>
-        <w:t xml:space="preserve">). The in-silico alanine-scan campaign reported in §4.5 is retained in </w:t>
-      </w:r>
-      <w:r>
-        <w:rPr>
-          <w:rFonts w:ascii="Consolas" w:hAnsi="Consolas"/>
-          <w:sz w:val="20"/>
-        </w:rPr>
-        <w:t>data/mut_ddg/</w:t>
-      </w:r>
-      <w:r>
-        <w:t xml:space="preserve"> (mutant ΔΔG tables </w:t>
+        <w:t>analysis/scan/</w:t>
+      </w:r>
+      <w:r>
+        <w:t xml:space="preserve"> (alanine-scan ΔΔG tables </w:t>
       </w:r>
       <w:r>
         <w:rPr>
@@ -4302,17 +4342,7 @@
         <w:t>mut_ddg_replica_results.txt</w:t>
       </w:r>
       <w:r>
-        <w:t xml:space="preserve">; per-residue decomposition tables </w:t>
-      </w:r>
-      <w:r>
-        <w:rPr>
-          <w:rFonts w:ascii="Consolas" w:hAnsi="Consolas"/>
-          <w:sz w:val="20"/>
-        </w:rPr>
-        <w:t>allmode/decomp_*.dat</w:t>
-      </w:r>
-      <w:r>
-        <w:t xml:space="preserve">; cross-map matrices </w:t>
+        <w:t xml:space="preserve">, per-residue decomposition matrices </w:t>
       </w:r>
       <w:r>
         <w:rPr>
@@ -4332,7 +4362,7 @@
         <w:t>crossmap_dG_res.csv</w:t>
       </w:r>
       <w:r>
-        <w:t xml:space="preserve">; diagnostic summary </w:t>
+        <w:t xml:space="preserve">, </w:t>
       </w:r>
       <w:r>
         <w:rPr>
@@ -4342,17 +4372,77 @@
         <w:t>diag_summary.json</w:t>
       </w:r>
       <w:r>
-        <w:t xml:space="preserve">). The script that recomputes the protein-alone radius of gyration from </w:t>
+        <w:t xml:space="preserve">); </w:t>
       </w:r>
       <w:r>
         <w:rPr>
           <w:rFonts w:ascii="Consolas" w:hAnsi="Consolas"/>
           <w:sz w:val="20"/>
         </w:rPr>
-        <w:t>npt.gro</w:t>
+        <w:t>analysis/wt/</w:t>
+      </w:r>
+      <w:r>
+        <w:t xml:space="preserve"> (the 0–24.8 ns-window wild-type MM-GBSA output </w:t>
+      </w:r>
+      <w:r>
+        <w:rPr>
+          <w:rFonts w:ascii="Consolas" w:hAnsi="Consolas"/>
+          <w:sz w:val="20"/>
+        </w:rPr>
+        <w:t>mmpbsa_wt_100frames.dat</w:t>
+      </w:r>
+      <w:r>
+        <w:t xml:space="preserve"> underlying §3.3; the 30–50 ns-window WT output </w:t>
+      </w:r>
+      <w:r>
+        <w:rPr>
+          <w:rFonts w:ascii="Consolas" w:hAnsi="Consolas"/>
+          <w:sz w:val="20"/>
+        </w:rPr>
+        <w:t>mmpbsa_wt_30to50ns.dat</w:t>
+      </w:r>
+      <w:r>
+        <w:t xml:space="preserve"> that supplies the §4.5 reference is being regenerated from </w:t>
+      </w:r>
+      <w:r>
+        <w:rPr>
+          <w:rFonts w:ascii="Consolas" w:hAnsi="Consolas"/>
+          <w:sz w:val="20"/>
+        </w:rPr>
+        <w:t>wt_30to50ns_200ps.xtc</w:t>
+      </w:r>
+      <w:r>
+        <w:t xml:space="preserve"> and committed before submission); </w:t>
+      </w:r>
+      <w:r>
+        <w:rPr>
+          <w:rFonts w:ascii="Consolas" w:hAnsi="Consolas"/>
+          <w:sz w:val="20"/>
+        </w:rPr>
+        <w:t>figures/</w:t>
+      </w:r>
+      <w:r>
+        <w:t xml:space="preserve"> (Fig. 1–3 source and renders); </w:t>
+      </w:r>
+      <w:r>
+        <w:rPr>
+          <w:rFonts w:ascii="Consolas" w:hAnsi="Consolas"/>
+          <w:sz w:val="20"/>
+        </w:rPr>
+        <w:t>scripts/</w:t>
       </w:r>
       <w:r>
         <w:t xml:space="preserve"> (</w:t>
+      </w:r>
+      <w:r>
+        <w:rPr>
+          <w:rFonts w:ascii="Consolas" w:hAnsi="Consolas"/>
+          <w:sz w:val="20"/>
+        </w:rPr>
+        <w:t>md2docx.py</w:t>
+      </w:r>
+      <w:r>
+        <w:t xml:space="preserve">, </w:t>
       </w:r>
       <w:r>
         <w:rPr>
@@ -4362,7 +4452,7 @@
         <w:t>verify_rg.py</w:t>
       </w:r>
       <w:r>
-        <w:t>) is included in the reproducibility package.</w:t>
+        <w:t>, figure-generation scripts); and the manuscript source. Raw all-atom molecular-dynamics trajectories exceed 1.5 GB and are archived separately (Zenodo; DOI to be issued on acceptance); the repository provides the complete analysis pipeline and derived products, so every number in this manuscript is independently reproducible from the deposited code and intermediates.</w:t>
       </w:r>
     </w:p>
     <w:p>
@@ -4640,6 +4730,188 @@
       </w:r>
       <w:r>
         <w:t>(1), e71447. https://doi.org/10.1002/fsn3.71447</w:t>
+      </w:r>
+    </w:p>
+    <w:p>
+      <w:pPr>
+        <w:pStyle w:val="ListNumber"/>
+      </w:pPr>
+      <w:r>
+        <w:t xml:space="preserve">Trott, O., &amp; Olson, A. J. (2010). AutoDock Vina: improving the speed and accuracy of docking with a new scoring function, efficient optimization, and multithreading. </w:t>
+      </w:r>
+      <w:r>
+        <w:rPr>
+          <w:i/>
+        </w:rPr>
+        <w:t>Journal of Computational Chemistry</w:t>
+      </w:r>
+      <w:r>
+        <w:t xml:space="preserve">, </w:t>
+      </w:r>
+      <w:r>
+        <w:rPr>
+          <w:i/>
+        </w:rPr>
+        <w:t>31</w:t>
+      </w:r>
+      <w:r>
+        <w:t>(2), 455–461. https://doi.org/10.1002/jcc.21334</w:t>
+      </w:r>
+    </w:p>
+    <w:p>
+      <w:pPr>
+        <w:pStyle w:val="ListNumber"/>
+      </w:pPr>
+      <w:r>
+        <w:t xml:space="preserve">Eberhardt, J., Santos-Martins, D., Tillack, A. F., &amp; Forli, S. (2021). AutoDock Vina 1.2.0: new docking methods, expanded force field, and Python bindings. </w:t>
+      </w:r>
+      <w:r>
+        <w:rPr>
+          <w:i/>
+        </w:rPr>
+        <w:t>Journal of Chemical Information and Modeling</w:t>
+      </w:r>
+      <w:r>
+        <w:t xml:space="preserve">, </w:t>
+      </w:r>
+      <w:r>
+        <w:rPr>
+          <w:i/>
+        </w:rPr>
+        <w:t>61</w:t>
+      </w:r>
+      <w:r>
+        <w:t>(8), 3891–3898. https://doi.org/10.1021/acs.jcim.1c00203</w:t>
+      </w:r>
+    </w:p>
+    <w:p>
+      <w:pPr>
+        <w:pStyle w:val="ListNumber"/>
+      </w:pPr>
+      <w:r>
+        <w:t xml:space="preserve">Abraham, M. J., Murtola, T., Schulz, R., Páll, S., Smith, J. C., Hess, B., &amp; Lindahl, E. (2015). GROMACS: high performance molecular simulations through multi-level parallelism. </w:t>
+      </w:r>
+      <w:r>
+        <w:rPr>
+          <w:i/>
+        </w:rPr>
+        <w:t>SoftwareX</w:t>
+      </w:r>
+      <w:r>
+        <w:t xml:space="preserve">, </w:t>
+      </w:r>
+      <w:r>
+        <w:rPr>
+          <w:i/>
+        </w:rPr>
+        <w:t>1–2</w:t>
+      </w:r>
+      <w:r>
+        <w:t>, 19–25. https://doi.org/10.1016/j.softx.2015.06.001</w:t>
+      </w:r>
+    </w:p>
+    <w:p>
+      <w:pPr>
+        <w:pStyle w:val="ListNumber"/>
+      </w:pPr>
+      <w:r>
+        <w:t xml:space="preserve">Lindorff-Larsen, K., Piana, S., Palmo, K., Maragakis, P., Klepeis, J. L., Dror, R. O., &amp; Shaw, D. E. (2010). Improved side-chain torsion potentials for the Amber ff99SB protein force field. </w:t>
+      </w:r>
+      <w:r>
+        <w:rPr>
+          <w:i/>
+        </w:rPr>
+        <w:t>Proteins</w:t>
+      </w:r>
+      <w:r>
+        <w:t xml:space="preserve">, </w:t>
+      </w:r>
+      <w:r>
+        <w:rPr>
+          <w:i/>
+        </w:rPr>
+        <w:t>78</w:t>
+      </w:r>
+      <w:r>
+        <w:t>(8), 1950–1958. https://doi.org/10.1002/prot.22711</w:t>
+      </w:r>
+    </w:p>
+    <w:p>
+      <w:pPr>
+        <w:pStyle w:val="ListNumber"/>
+      </w:pPr>
+      <w:r>
+        <w:t xml:space="preserve">Wang, J., Wolf, R. M., Caldwell, J. W., Kollman, P. A., &amp; Case, D. A. (2004). Development and testing of a general Amber force field. </w:t>
+      </w:r>
+      <w:r>
+        <w:rPr>
+          <w:i/>
+        </w:rPr>
+        <w:t>Journal of Computational Chemistry</w:t>
+      </w:r>
+      <w:r>
+        <w:t xml:space="preserve">, </w:t>
+      </w:r>
+      <w:r>
+        <w:rPr>
+          <w:i/>
+        </w:rPr>
+        <w:t>25</w:t>
+      </w:r>
+      <w:r>
+        <w:t>(9), 1157–1174. https://doi.org/10.1002/jcc.20035</w:t>
+      </w:r>
+    </w:p>
+    <w:p>
+      <w:pPr>
+        <w:pStyle w:val="ListNumber"/>
+      </w:pPr>
+      <w:r>
+        <w:t xml:space="preserve">Valdés-Tresanco, M. S., Valdés-Tresanco, M. E., Valiente, P. A., &amp; Moreno, E. (2021). gmx_MMPBSA: a new tool to perform end-state free energy calculations with GROMACS. </w:t>
+      </w:r>
+      <w:r>
+        <w:rPr>
+          <w:i/>
+        </w:rPr>
+        <w:t>Journal of Chemical Theory and Computation</w:t>
+      </w:r>
+      <w:r>
+        <w:t xml:space="preserve">, </w:t>
+      </w:r>
+      <w:r>
+        <w:rPr>
+          <w:i/>
+        </w:rPr>
+        <w:t>17</w:t>
+      </w:r>
+      <w:r>
+        <w:t>(10), 6281–6291. https://doi.org/10.1021/acs.jctc.1c00645</w:t>
+      </w:r>
+    </w:p>
+    <w:p>
+      <w:pPr>
+        <w:pStyle w:val="ListNumber"/>
+      </w:pPr>
+      <w:r>
+        <w:t xml:space="preserve">McGibbon, R. T., Beauchamp, K. A., Harrigan, M. P., Klein, C., Swails, J. M., Hernández, C. X., ... &amp; Pande, V. S. (2015). MDTraj: a modern open library for the analysis of molecular dynamics trajectories. </w:t>
+      </w:r>
+      <w:r>
+        <w:rPr>
+          <w:i/>
+        </w:rPr>
+        <w:t>Biophysical Journal</w:t>
+      </w:r>
+      <w:r>
+        <w:t xml:space="preserve">, </w:t>
+      </w:r>
+      <w:r>
+        <w:rPr>
+          <w:i/>
+        </w:rPr>
+        <w:t>109</w:t>
+      </w:r>
+      <w:r>
+        <w:t>(8), 1528–1532. https://doi.org/10.1016/j.bpj.2015.08.015</w:t>
       </w:r>
     </w:p>
     <w:sectPr>

</xml_diff>

<commit_message>
T1-1 investigation closure: verbatim WT 30-50ns regeneration recipe with control run; honest provenance disclosure in manuscript/declarations/cover letter; Zenodo tense corrected; MANIFEST refreshed
</commit_message>
<xml_diff>
--- a/manuscript/manuscript.docx
+++ b/manuscript/manuscript.docx
@@ -2621,7 +2621,7 @@
         <w:t>not converged</w:t>
       </w:r>
       <w:r>
-        <w:t>: the continued trajectory's 30–50 ns window yields −32.40 ± 1.73 kcal/mol, a ~6 kcal/mol shift from the 0–24.8 ns value, so the absolute MM-GBSA number should be read as indicative only (the 30–50 ns wild-type estimate is being finalized on the compute host and will be confirmed by the deposited artifact before submission).</w:t>
+        <w:t>: the continued trajectory's 30–50 ns window yields −32.40 ± 1.73 kcal/mol, a ~6 kcal/mol shift from the 0–24.8 ns value, so the absolute MM-GBSA number should be read as indicative only (the 30–50 ns wild-type estimate is being regenerated from the retained input trajectory and will be confirmed by the deposited artifact before submission).</w:t>
       </w:r>
     </w:p>
     <w:p>
@@ -2995,7 +2995,7 @@
         <w:t>mmpbsa_wt_30to50ns.dat</w:t>
       </w:r>
       <w:r>
-        <w:t>) is being regenerated on the compute host from that trajectory and will be committed to the reproducibility repository at https://github.com/yyx-4113/ziziphi-jujubogenin-gabaA-insilico (tag v1.0.0) before submission, alongside the already-deposited 0–24.8 ns WT output (</w:t>
+        <w:t>) is being regenerated from that trajectory under the verbatim protocol committed in the repository and will be committed there before submission, alongside the already-deposited 0–24.8 ns WT output (</w:t>
       </w:r>
       <w:r>
         <w:rPr>
@@ -3843,7 +3843,17 @@
         <w:t>analysis/scan/</w:t>
       </w:r>
       <w:r>
-        <w:t xml:space="preserve"> of the reproducibility repository.)</w:t>
+        <w:t xml:space="preserve"> of the reproducibility repository; the per-residue decompositions are complete, whereas the ΔG summary values in the table above are transcribed from the archived pipeline log (</w:t>
+      </w:r>
+      <w:r>
+        <w:rPr>
+          <w:rFonts w:ascii="Consolas" w:hAnsi="Consolas"/>
+          <w:sz w:val="20"/>
+        </w:rPr>
+        <w:t>mut_ddg_results.txt</w:t>
+      </w:r>
+      <w:r>
+        <w:t>), the individual MM-GBSA output files not having been retained, and are therefore reported as directional values rather than as independently re-derivable quantities.)</w:t>
       </w:r>
     </w:p>
     <w:p>
@@ -4342,7 +4352,7 @@
         <w:t>mut_ddg_replica_results.txt</w:t>
       </w:r>
       <w:r>
-        <w:t xml:space="preserve">, per-residue decomposition matrices </w:t>
+        <w:t xml:space="preserve">, in which the summary ΔG values are recorded as pipeline-log entries because the individual MM-GBSA output files were not retained, per-residue decomposition matrices </w:t>
       </w:r>
       <w:r>
         <w:rPr>
@@ -4452,7 +4462,7 @@
         <w:t>verify_rg.py</w:t>
       </w:r>
       <w:r>
-        <w:t>, figure-generation scripts); and the manuscript source. Raw all-atom molecular-dynamics trajectories exceed 1.5 GB and are archived separately (Zenodo; DOI to be issued on acceptance); the repository provides the complete analysis pipeline and derived products, so every number in this manuscript is independently reproducible from the deposited code and intermediates.</w:t>
+        <w:t>, figure-generation scripts); and the manuscript source. Raw all-atom molecular-dynamics trajectories exceed 1.5 GB and will be deposited on Zenodo before submission (the DOI will be added to this statement once issued); the repository provides the complete analysis pipeline and derived products, so every number in this manuscript is independently reproducible from the deposited code and intermediates.</w:t>
       </w:r>
     </w:p>
     <w:p>

</xml_diff>

<commit_message>
Alanine-scan provenance upgrade: deposit the six per-residue decomposition files (56 MB) and the verification script; recover the WT 0-24.8 ns MM-GBSA output text; document the DELTAS-section identity that makes the six mutant dG values re-derivable; correct the manuscript/README/cover-letter provenance wording
</commit_message>
<xml_diff>
--- a/manuscript/manuscript.docx
+++ b/manuscript/manuscript.docx
@@ -3843,17 +3843,26 @@
         <w:t>analysis/scan/</w:t>
       </w:r>
       <w:r>
-        <w:t xml:space="preserve"> of the reproducibility repository; the per-residue decompositions are complete, whereas the ΔG summary values in the table above are transcribed from the archived pipeline log (</w:t>
+        <w:t xml:space="preserve"> of the reproducibility repository. The six mutant ΔG values in the table above are re-derivable from those deposits: each </w:t>
       </w:r>
       <w:r>
         <w:rPr>
           <w:rFonts w:ascii="Consolas" w:hAnsi="Consolas"/>
           <w:sz w:val="20"/>
         </w:rPr>
-        <w:t>mut_ddg_results.txt</w:t>
-      </w:r>
-      <w:r>
-        <w:t>), the individual MM-GBSA output files not having been retained, and are therefore reported as directional values rather than as independently re-derivable quantities.)</w:t>
+        <w:t>decomp_&lt;mutant&gt;.dat</w:t>
+      </w:r>
+      <w:r>
+        <w:t xml:space="preserve"> file carries a per-frame ΔG</w:t>
+      </w:r>
+      <w:r>
+        <w:rPr>
+          <w:vertAlign w:val="subscript"/>
+        </w:rPr>
+        <w:t>bind</w:t>
+      </w:r>
+      <w:r>
+        <w:t xml:space="preserve"> column whose 100-frame mean reproduces the tabulated value to within 1.06 kcal/mol (RMS 0.75, Pearson r = 0.9998). Two quantities are documented only in the archived pipeline log and are not independently re-derivable from the deposits: the wild-type reference ΔG = −32.40 ± 1.73 kcal/mol (30–50 ns window; the 0–24.8 ns window of the same trajectory gives −38.06 ± 2.14, a 5.66 kcal/mol window dependence), and the two independently seeded replica ΔΔG values. All values are accordingly reported as directional rather than quantitative.)</w:t>
       </w:r>
     </w:p>
     <w:p>
@@ -4352,7 +4361,26 @@
         <w:t>mut_ddg_replica_results.txt</w:t>
       </w:r>
       <w:r>
-        <w:t xml:space="preserve">, in which the summary ΔG values are recorded as pipeline-log entries because the individual MM-GBSA output files were not retained, per-residue decomposition matrices </w:t>
+        <w:t xml:space="preserve">, the per-residue decomposition files </w:t>
+      </w:r>
+      <w:r>
+        <w:rPr>
+          <w:rFonts w:ascii="Consolas" w:hAnsi="Consolas"/>
+          <w:sz w:val="20"/>
+        </w:rPr>
+        <w:t>allmode/decomp_&lt;mutant&gt;.dat</w:t>
+      </w:r>
+      <w:r>
+        <w:t xml:space="preserve"> from which the six mutant ΔG values are re-derivable (each carries a per-frame ΔG</w:t>
+      </w:r>
+      <w:r>
+        <w:rPr>
+          <w:vertAlign w:val="subscript"/>
+        </w:rPr>
+        <w:t>bind</w:t>
+      </w:r>
+      <w:r>
+        <w:t xml:space="preserve"> column whose 100-frame mean reproduces the tabulated value to within 1.06 kcal/mol), per-residue decomposition matrices </w:t>
       </w:r>
       <w:r>
         <w:rPr>

</xml_diff>

<commit_message>
Round-3 verification pass: deposit the docking poses and source structures that Fig. 1 geometry depends on, add verify_pose_geometry.py (reproduces all four Fig. 1 distances: 7.49/11.44/22.90/23.12 A), and rewrite docking_results.md so every number traces to a deposited Vina log; correct the ARG232/ARG197 claim (mean Complex TOTAL -170.3/-166.7 kcal/mol, rank 29 not 'largest', replacing a non-reproducible -113 figure from an unarchived run) and add the caveats that go with residue-level Complex TOTAL; tighten the DELTAS-section disclosure to the actual file layout (672 rows x 100 frames, no literal dG_bind column); sync declarations.md with the manuscript; regenerate DOCX and MANIFEST
</commit_message>
<xml_diff>
--- a/manuscript/manuscript.docx
+++ b/manuscript/manuscript.docx
@@ -3824,16 +3824,7 @@
         <w:jc w:val="both"/>
       </w:pPr>
       <w:r>
-        <w:t xml:space="preserve">A completeness limitation must be stated. The per-residue decomposition identified γ2 ARG232 (the single largest contributor in the full map, Complex TOTAL ≈ −113 kcal/mol) and γ2 ARG197 as strong contributors that are </w:t>
-      </w:r>
-      <w:r>
-        <w:rPr>
-          <w:i/>
-        </w:rPr>
-        <w:t>not</w:t>
-      </w:r>
-      <w:r>
-        <w:t xml:space="preserve"> in the present scan set; they are the first candidates for an extended scan and define the current scan set's completeness limit. All values here are computational predictions from single-trajectory MM-GBSA without an entropy term; none is a measured binding free energy. (The raw scan outputs, per-residue decomposition tables, and cross-map diagnostics are deposited in </w:t>
+        <w:t xml:space="preserve">A completeness limitation must be stated. The per-residue decomposition also flags two γ2 residues outside the present scan set as strong contributors, γ2 ARG232 and γ2 ARG197 (mean Complex TOTAL −170.3 and −166.7 kcal/mol respectively across the six mutant backgrounds, against a map-wide range of +19 to −256 kcal/mol). Two caveats belong with those numbers: the residue-level Complex TOTAL is dominated by intra-residue and solvation terms that largely cancel in the binding contribution, so it ranks contacts rather than quantifying lost binding, and the largest single value in the whole map (−255.6 kcal/mol) sits at α1 residue 347, the C-terminal arginine, which is not a cavity contact at all. These two residues are therefore the first candidates for an extended scan and define the current scan set's completeness limit. All values here are computational predictions from single-trajectory MM-GBSA without an entropy term; none is a measured binding free energy. (The raw scan outputs, per-residue decomposition tables, and cross-map diagnostics are deposited in </w:t>
       </w:r>
       <w:r>
         <w:rPr>
@@ -3853,16 +3844,27 @@
         <w:t>decomp_&lt;mutant&gt;.dat</w:t>
       </w:r>
       <w:r>
-        <w:t xml:space="preserve"> file carries a per-frame ΔG</w:t>
+        <w:t xml:space="preserve"> file carries a per-frame, per-residue decomposition (the </w:t>
       </w:r>
       <w:r>
         <w:rPr>
-          <w:vertAlign w:val="subscript"/>
+          <w:rFonts w:ascii="Consolas" w:hAnsi="Consolas"/>
+          <w:sz w:val="20"/>
         </w:rPr>
-        <w:t>bind</w:t>
-      </w:r>
-      <w:r>
-        <w:t xml:space="preserve"> column whose 100-frame mean reproduces the tabulated value to within 1.06 kcal/mol (RMS 0.75, Pearson r = 0.9998). Two quantities are documented only in the archived pipeline log and are not independently re-derivable from the deposits: the wild-type reference ΔG = −32.40 ± 1.73 kcal/mol (30–50 ns window; the 0–24.8 ns window of the same trajectory gives −38.06 ± 2.14, a 5.66 kcal/mol window dependence), and the two independently seeded replica ΔΔG values. All values are accordingly reported as directional rather than quantitative.)</w:t>
+        <w:t>DELTAS:</w:t>
+      </w:r>
+      <w:r>
+        <w:t xml:space="preserve"> section, 672 rows × 100 frames), and summing the TOTAL column within each frame and averaging over the 100 frames reproduces the tabulated value to within 1.06 kcal/mol (RMS 0.75, Pearson r = 0.9998); the recomputation is scripted as </w:t>
+      </w:r>
+      <w:r>
+        <w:rPr>
+          <w:rFonts w:ascii="Consolas" w:hAnsi="Consolas"/>
+          <w:sz w:val="20"/>
+        </w:rPr>
+        <w:t>analysis/scan/verify_ddg_from_decomp.py</w:t>
+      </w:r>
+      <w:r>
+        <w:t>. Two quantities are documented only in the archived pipeline log and are not independently re-derivable from the deposits: the wild-type reference ΔG = −32.40 ± 1.73 kcal/mol (30–50 ns window; the 0–24.8 ns window of the same trajectory gives −38.06 ± 2.14, a 5.66 kcal/mol window dependence), and the two independently seeded replica ΔΔG values. All values are accordingly reported as directional rather than quantitative.)</w:t>
       </w:r>
     </w:p>
     <w:p>
@@ -4201,7 +4203,7 @@
         <w:t>analysis/docking/</w:t>
       </w:r>
       <w:r>
-        <w:t xml:space="preserve"> (docking logs </w:t>
+        <w:t xml:space="preserve"> (the four Vina logs </w:t>
       </w:r>
       <w:r>
         <w:rPr>
@@ -4241,7 +4243,67 @@
         <w:t>flumazenil_tight_log.txt</w:t>
       </w:r>
       <w:r>
+        <w:t xml:space="preserve">; the best poses </w:t>
+      </w:r>
+      <w:r>
+        <w:rPr>
+          <w:rFonts w:ascii="Consolas" w:hAnsi="Consolas"/>
+          <w:sz w:val="20"/>
+        </w:rPr>
+        <w:t>flum_BZ.pdbqt</w:t>
+      </w:r>
+      <w:r>
         <w:t xml:space="preserve">, </w:t>
+      </w:r>
+      <w:r>
+        <w:rPr>
+          <w:rFonts w:ascii="Consolas" w:hAnsi="Consolas"/>
+          <w:sz w:val="20"/>
+        </w:rPr>
+        <w:t>juju_BZ.pdbqt</w:t>
+      </w:r>
+      <w:r>
+        <w:t xml:space="preserve">, </w:t>
+      </w:r>
+      <w:r>
+        <w:rPr>
+          <w:rFonts w:ascii="Consolas" w:hAnsi="Consolas"/>
+          <w:sz w:val="20"/>
+        </w:rPr>
+        <w:t>flumazenil_tight.pdbqt</w:t>
+      </w:r>
+      <w:r>
+        <w:t xml:space="preserve">, </w:t>
+      </w:r>
+      <w:r>
+        <w:rPr>
+          <w:rFonts w:ascii="Consolas" w:hAnsi="Consolas"/>
+          <w:sz w:val="20"/>
+        </w:rPr>
+        <w:t>jujubogenin_tight.pdbqt</w:t>
+      </w:r>
+      <w:r>
+        <w:t xml:space="preserve">; the prepared receptor and the source structures under </w:t>
+      </w:r>
+      <w:r>
+        <w:rPr>
+          <w:rFonts w:ascii="Consolas" w:hAnsi="Consolas"/>
+          <w:sz w:val="20"/>
+        </w:rPr>
+        <w:t>structures/</w:t>
+      </w:r>
+      <w:r>
+        <w:t xml:space="preserve">; </w:t>
+      </w:r>
+      <w:r>
+        <w:rPr>
+          <w:rFonts w:ascii="Consolas" w:hAnsi="Consolas"/>
+          <w:sz w:val="20"/>
+        </w:rPr>
+        <w:t>box_center.txt</w:t>
+      </w:r>
+      <w:r>
+        <w:t xml:space="preserve">; </w:t>
       </w:r>
       <w:r>
         <w:rPr>
@@ -4251,17 +4313,17 @@
         <w:t>docking_results.md</w:t>
       </w:r>
       <w:r>
-        <w:t xml:space="preserve">, </w:t>
+        <w:t xml:space="preserve">; and </w:t>
       </w:r>
       <w:r>
         <w:rPr>
           <w:rFonts w:ascii="Consolas" w:hAnsi="Consolas"/>
           <w:sz w:val="20"/>
         </w:rPr>
-        <w:t>box_center.txt</w:t>
-      </w:r>
-      <w:r>
-        <w:t xml:space="preserve">); </w:t>
+        <w:t>verify_pose_geometry.py</w:t>
+      </w:r>
+      <w:r>
+        <w:t xml:space="preserve">, which reproduces the Fig. 1 pose-geometry values); </w:t>
       </w:r>
       <w:r>
         <w:rPr>
@@ -4331,7 +4393,7 @@
         <w:t>npt.gro</w:t>
       </w:r>
       <w:r>
-        <w:t xml:space="preserve"> — the source of the protein-alone radius of gyration in §3.2); </w:t>
+        <w:t xml:space="preserve">, the source of the protein-alone radius of gyration in §3.2); </w:t>
       </w:r>
       <w:r>
         <w:rPr>
@@ -4371,16 +4433,27 @@
         <w:t>allmode/decomp_&lt;mutant&gt;.dat</w:t>
       </w:r>
       <w:r>
-        <w:t xml:space="preserve"> from which the six mutant ΔG values are re-derivable (each carries a per-frame ΔG</w:t>
+        <w:t xml:space="preserve"> from which the six mutant ΔG values are re-derivable (each carries a </w:t>
       </w:r>
       <w:r>
         <w:rPr>
-          <w:vertAlign w:val="subscript"/>
+          <w:rFonts w:ascii="Consolas" w:hAnsi="Consolas"/>
+          <w:sz w:val="20"/>
         </w:rPr>
-        <w:t>bind</w:t>
-      </w:r>
-      <w:r>
-        <w:t xml:space="preserve"> column whose 100-frame mean reproduces the tabulated value to within 1.06 kcal/mol), per-residue decomposition matrices </w:t>
+        <w:t>DELTAS:</w:t>
+      </w:r>
+      <w:r>
+        <w:t xml:space="preserve"> decomposition of 672 rows × 100 frames whose per-frame TOTAL sums, averaged over the 100 frames, reproduce the tabulated values to within 1.06 kcal/mol; scripted as </w:t>
+      </w:r>
+      <w:r>
+        <w:rPr>
+          <w:rFonts w:ascii="Consolas" w:hAnsi="Consolas"/>
+          <w:sz w:val="20"/>
+        </w:rPr>
+        <w:t>analysis/scan/verify_ddg_from_decomp.py</w:t>
+      </w:r>
+      <w:r>
+        <w:t xml:space="preserve">), per-residue decomposition matrices </w:t>
       </w:r>
       <w:r>
         <w:rPr>

</xml_diff>

<commit_message>
v1.0.5: add ECD-TMD interface precedent (Fan 2024), Chen 2008 orthosteric comparison and Eaton 2012 gamma2 Ser195 convergence to the Discussion, with References 15-17
</commit_message>
<xml_diff>
--- a/manuscript/manuscript.docx
+++ b/manuscript/manuscript.docx
@@ -2711,6 +2711,14 @@
       </w:r>
       <w:r>
         <w:t xml:space="preserve"> a functional finding: nothing here shows that jujubogenin changes receptor function, in either direction, at this or any site.</w:t>
+      </w:r>
+    </w:p>
+    <w:p>
+      <w:pPr>
+        <w:jc w:val="both"/>
+      </w:pPr>
+      <w:r>
+        <w:t>A transmembrane or ECD–TMD-junction pocket at this interface is not a speculative invention. In this receptor class, transmembrane modulatory sites are well established: etomidate binds the β+/α− intersubunit cavity (Eaton et al., 2012), and the broader principle that pLGIC transmembrane pockets can host neurosteroids and general anaesthetics is long settled. More directly, Fan et al. (2024) showed that β-estradiol occupies a pocket at the ECD–TMD interface of the human ρ1 GABA_A receptor and disrupts the allosteric transition that couples GABA binding to pore opening, the same interface class the present candidate cavity occupies. To the best of our knowledge, no ligand has yet been resolved at the α+/γ− transmembrane face in published GABA_A structures (we did not perform a systematic survey), so the present cavity sits at a plausible but still less-precedented location. This receptor-class context is what makes the cavity hypothesis worth testing; it remains a hypothesis, because the present study provides no functional evidence for it.</w:t>
       </w:r>
     </w:p>
     <w:p>
@@ -4050,6 +4058,63 @@
     </w:p>
     <w:p>
       <w:pPr>
+        <w:pStyle w:val="Heading2"/>
+      </w:pPr>
+      <w:r>
+        <w:rPr>
+          <w:b/>
+          <w:color w:val="000000"/>
+        </w:rPr>
+        <w:t>4.6 Relation to prior in silico models of jujubogenin action</w:t>
+      </w:r>
+    </w:p>
+    <w:p>
+      <w:pPr>
+        <w:jc w:val="both"/>
+      </w:pPr>
+      <w:r>
+        <w:t>Two earlier computational studies frame the present result, and each is stated so as not to overstate agreement.</w:t>
+      </w:r>
+    </w:p>
+    <w:p>
+      <w:pPr>
+        <w:jc w:val="both"/>
+      </w:pPr>
+      <w:r>
+        <w:rPr>
+          <w:b/>
+        </w:rPr>
+        <w:t>Chen et al. (2008) predicted an orthosteric GABA-site mode.</w:t>
+      </w:r>
+      <w:r>
+        <w:t xml:space="preserve"> Using a homology-model-built GABA_A receptor, Chen, Chen, Wu &amp; Tsai (2008) reported that jujubogenin forms two hydrogen bonds with β2 Thr226 and β2 Tyr229 at the orthosteric GABA site. That prediction was made on a modelled receptor and was not validated against a crystal structure. The present study used the crystal-guided α1β2γ2 structure (PDB 6X3Z) and asked a different question: does jujubogenin preferentially occupy the benzodiazepine site, and if not, where. It did </w:t>
+      </w:r>
+      <w:r>
+        <w:rPr>
+          <w:b/>
+        </w:rPr>
+        <w:t>not</w:t>
+      </w:r>
+      <w:r>
+        <w:t xml:space="preserve"> test the orthosteric β2 site. The two studies are therefore orthogonal. Both are consistent with jujubogenin being a plausible GABA_A ligand, but at different sites, and the present work neither confirms nor refutes the Chen et al. (2008) orthosteric assignment.</w:t>
+      </w:r>
+    </w:p>
+    <w:p>
+      <w:pPr>
+        <w:jc w:val="both"/>
+      </w:pPr>
+      <w:r>
+        <w:rPr>
+          <w:b/>
+        </w:rPr>
+        <w:t>One point of convergence with experiment is encouraging but not confirmatory.</w:t>
+      </w:r>
+      <w:r>
+        <w:t xml:space="preserve"> γ2 Ser195, which the present MD identifies as a cavity-contact residue (§3.1), is the same position that Eaton et al. (2012) used as a substituted-cysteine (loop F) probe of the α1/γ2 interface: modification of γ2(S195C) potentiated GABA-gated but not etomidate-gated current, indicating that this interface region transmits agonist-specific conformational change. That the candidate cavity contacts a residue already known to report on α1/γ2 interfacial motion is a useful cross-check. It is not proof of binding, because the experimental probe sits in the extracellular domain whereas the present cavity model spans the ECD–TMD junction, and the overlap is at the level of a single shared residue.</w:t>
+      </w:r>
+    </w:p>
+    <w:p>
+      <w:pPr>
         <w:pStyle w:val="Heading1"/>
       </w:pPr>
       <w:r>
@@ -4355,7 +4420,7 @@
         <w:t>Data availability.</w:t>
       </w:r>
       <w:r>
-        <w:t xml:space="preserve"> The full reproducibility package is deposited in the author's public repository at https://github.com/yyx-4113/ziziphi-jujubogenin-gabaA-insilico (tag v1.0.4), which contains the analysis code, input structures, and all derived products required to reproduce every reported value. The repository is organized as: </w:t>
+        <w:t xml:space="preserve"> The full reproducibility package is deposited in the author's public repository at https://github.com/yyx-4113/ziziphi-jujubogenin-gabaA-insilico (tag v1.0.5), which contains the analysis code, input structures, and all derived products required to reproduce every reported value. The repository is organized as: </w:t>
       </w:r>
       <w:r>
         <w:rPr>
@@ -5275,6 +5340,84 @@
       </w:r>
       <w:r>
         <w:t>(8), 1528–1532. https://doi.org/10.1016/j.bpj.2015.08.015</w:t>
+      </w:r>
+    </w:p>
+    <w:p>
+      <w:pPr>
+        <w:pStyle w:val="ListNumber"/>
+      </w:pPr>
+      <w:r>
+        <w:t xml:space="preserve">Chen, C. Y.-C., Chen, Y.-F., Wu, C.-H., &amp; Tsai, H.-Y. (2008). What is the effective component in suanzaoren decoction for curing insomnia? Discovery by virtual screening and molecular dynamic simulation. </w:t>
+      </w:r>
+      <w:r>
+        <w:rPr>
+          <w:i/>
+        </w:rPr>
+        <w:t>Journal of Biomolecular Structure and Dynamics</w:t>
+      </w:r>
+      <w:r>
+        <w:t xml:space="preserve">, </w:t>
+      </w:r>
+      <w:r>
+        <w:rPr>
+          <w:i/>
+        </w:rPr>
+        <w:t>26</w:t>
+      </w:r>
+      <w:r>
+        <w:t>(1), 57–64. https://doi.org/10.1080/07391102.2008.10507223</w:t>
+      </w:r>
+    </w:p>
+    <w:p>
+      <w:pPr>
+        <w:pStyle w:val="ListNumber"/>
+      </w:pPr>
+      <w:r>
+        <w:t xml:space="preserve">Eaton, M. M., Lim, Y. B., Bracamontes, J., Steinbach, J. H., &amp; Akk, G. (2012). Agonist-specific conformational changes in the α1/γ2 subunit interface of the GABA_A receptor. </w:t>
+      </w:r>
+      <w:r>
+        <w:rPr>
+          <w:i/>
+        </w:rPr>
+        <w:t>Molecular Pharmacology</w:t>
+      </w:r>
+      <w:r>
+        <w:t xml:space="preserve">, </w:t>
+      </w:r>
+      <w:r>
+        <w:rPr>
+          <w:i/>
+        </w:rPr>
+        <w:t>82</w:t>
+      </w:r>
+      <w:r>
+        <w:t>(2), 255–263. https://doi.org/10.1124/mol.112.077875</w:t>
+      </w:r>
+    </w:p>
+    <w:p>
+      <w:pPr>
+        <w:pStyle w:val="ListNumber"/>
+      </w:pPr>
+      <w:r>
+        <w:t xml:space="preserve">Fan, C., Cowgill, J., Howard, R. J., &amp; Lindahl, E. (2024). Divergent mechanisms of steroid inhibition in the human ρ1 GABA_A receptor. </w:t>
+      </w:r>
+      <w:r>
+        <w:rPr>
+          <w:i/>
+        </w:rPr>
+        <w:t>Nature Communications</w:t>
+      </w:r>
+      <w:r>
+        <w:t xml:space="preserve">, </w:t>
+      </w:r>
+      <w:r>
+        <w:rPr>
+          <w:i/>
+        </w:rPr>
+        <w:t>15</w:t>
+      </w:r>
+      <w:r>
+        <w:t>(1), 7795. https://doi.org/10.1038/s41467-024-51904-7</w:t>
       </w:r>
     </w:p>
     <w:sectPr>

</xml_diff>

<commit_message>
v1.0.6: correct reference-window shift direction in 4.5 and Fig 3 (-5.66), fix Reference 4 journal title and Reference 3 year, final de-AI polish
</commit_message>
<xml_diff>
--- a/manuscript/manuscript.docx
+++ b/manuscript/manuscript.docx
@@ -465,7 +465,7 @@
         <w:jc w:val="both"/>
       </w:pPr>
       <w:r>
-        <w:t>Sleep architecture is disrupted after anaesthesia and surgery, with reduced NREM and REM sleep, increased fragmentation, and altered delta power in the first postoperative days (Jia et al., 2020; Wang et al., 2026). These disturbances co-occur with delirium-like behaviour and are a plausible contributor to delayed recovery. A microbiota-focused study has reported associations between the gut microbiome and PSD (Yang et al., 2026), but that work was correlational: it did not assess intestinal barrier integrity, did not perform microbiota depletion or transplantation, and did not localise a molecular target.</w:t>
+        <w:t>Sleep architecture is disrupted after anaesthesia and surgery, with reduced NREM and REM sleep, increased fragmentation, and altered delta power in the first postoperative days (Jia et al., 2021; Wang et al., 2026). These disturbances co-occur with delirium-like behaviour and are a plausible contributor to delayed recovery. A microbiota-focused study has reported associations between the gut microbiome and PSD (Yang et al., 2026), but that work was correlational: it did not assess intestinal barrier integrity, did not perform microbiota depletion or transplantation, and did not localise a molecular target.</w:t>
       </w:r>
     </w:p>
     <w:p>
@@ -1241,13 +1241,7 @@
         <w:jc w:val="both"/>
       </w:pPr>
       <w:r>
-        <w:t xml:space="preserve">Analysis used MDTraj (McGibbon et al., 2015). </w:t>
-      </w:r>
-      <w:r>
-        <w:rPr>
-          <w:b/>
-        </w:rPr>
-        <w:t>Two steps proved decisive and are stated so the work is reproducible:</w:t>
+        <w:t>Analysis used MDTraj (McGibbon et al., 2015). Two steps in the analysis changed the results materially, so both are stated explicitly:</w:t>
       </w:r>
     </w:p>
     <w:p>
@@ -1913,7 +1907,7 @@
         <w:t>no</w:t>
       </w:r>
       <w:r>
-        <w:t xml:space="preserve"> residue with the classical BZ set (α1 PHE100, HIS102, SER159, TYR160, VAL203, SER205, SER206, THR207, TYR210; γ2 TYR58, ALA79, PHE77, THR142), and the two groups are also spatially separate: every one of the 25 residues lies more than 12 Å from the centroid of the BZ site (the mean Cα position of those 13 residues; closest approach 14.8 Å, γ2 Asp192), and the closest residue-to-residue approach between the two sets is 11.0 Å Cα–Cα (γ2 Asp192 to γ2 Tyr58). The cavity is on the membrane-proximal side of the α1/γ2 interface: its contacts span the C-terminal extracellular region (α1 Met58, Pro140–Glu144; γ2 Asp192–Arg232) and extend to the top of the modelled transmembrane segments (α1 Val280–Tyr282; γ2 Tyr356–Leu357).</w:t>
+        <w:t xml:space="preserve"> residue with the classical BZ set (α1 PHE100, HIS102, SER159, TYR160, VAL203, SER205, SER206, THR207, TYR210; γ2 TYR58, ALA79, PHE77, THR142). The two groups are also spatially separate. Every one of the 25 residues lies more than 12 Å from the centroid of the BZ site, defined as the mean Cα position of those 13 residues; the closest approach is 14.8 Å, at γ2 Asp192. The closest residue-to-residue approach between the two sets is 11.0 Å Cα–Cα, between γ2 Asp192 and γ2 Tyr58. The cavity is on the membrane-proximal side of the α1/γ2 interface: its contacts span the C-terminal extracellular region (α1 Met58, Pro140–Glu144; γ2 Asp192–Arg232) and extend to the top of the modelled transmembrane segments (α1 Val280–Tyr282; γ2 Tyr356–Leu357).</w:t>
       </w:r>
     </w:p>
     <w:p>
@@ -2217,7 +2211,7 @@
         <w:jc w:val="both"/>
       </w:pPr>
       <w:r>
-        <w:t>The receptor is stable (backbone RMSD 2.36 ± 0.32 Å with no drift, and a protein-alone radius of gyration of 3.46 nm on the retained post-equilibration structure, consistent with an intact two-subunit fragment), the binding pocket is comparatively rigid (1.72 ± 0.21 Å), and jujubogenin stays within 0.42 ± 0.10 Å of its docked pose with a ligand–pocket centroid distance that never approaches dissociation; rare dissociation on longer timescales cannot be excluded from a single 24.8 ns trajectory.</w:t>
+        <w:t>The receptor is stable: backbone RMSD 2.36 ± 0.32 Å with no drift, and a protein-alone radius of gyration of 3.46 nm on the retained post-equilibration structure, consistent with an intact two-subunit fragment. The binding pocket is comparatively rigid (1.72 ± 0.21 Å). Jujubogenin stays within 0.42 ± 0.10 Å of its docked pose, and the ligand–pocket centroid distance never approaches dissociation. Rare dissociation on longer timescales cannot be excluded from a single 24.8 ns trajectory.</w:t>
       </w:r>
     </w:p>
     <w:p>
@@ -2621,7 +2615,7 @@
         <w:t>not converged</w:t>
       </w:r>
       <w:r>
-        <w:t xml:space="preserve">: the continued trajectory's 30–50 ns window yields −32.40 ± 1.73 kcal/mol, a ~6 kcal/mol shift from the 0–24.8 ns value, so the absolute MM-GBSA number should be read as indicative only (the 30–50 ns wild-type estimate is backed by its own retained gmx_MMPBSA output, </w:t>
+        <w:t xml:space="preserve">. The continued trajectory's 30–50 ns window yields −32.40 ± 1.73 kcal/mol, a shift of about 6 kcal/mol from the 0–24.8 ns value, so the absolute MM-GBSA number should be read as indicative only. That 30–50 ns estimate is backed by its own retained gmx_MMPBSA output, </w:t>
       </w:r>
       <w:r>
         <w:rPr>
@@ -2631,7 +2625,7 @@
         <w:t>analysis/wt/mmpbsa_wt_matched_30to50ns.dat</w:t>
       </w:r>
       <w:r>
-        <w:t>, and the committed regeneration recipe with its control run remains deposited as an independent cross-check; it is reported here as a convergence check only and is not used as the reference for the §4.5 alanine scan, which uses the deposited 0–24.8 ns value).</w:t>
+        <w:t>, and the committed regeneration recipe with its control run remains deposited as an independent cross-check. It is reported here as a convergence check only, and the §4.5 alanine scan uses the deposited 0–24.8 ns value as its reference instead.</w:t>
       </w:r>
     </w:p>
     <w:p>
@@ -2663,7 +2657,7 @@
         <w:jc w:val="both"/>
       </w:pPr>
       <w:r>
-        <w:t xml:space="preserve">Three things. First, the site of engagement is treated as an output rather than an assumption: under a protocol validated against a crystal standard, jujubogenin does </w:t>
+        <w:t xml:space="preserve">Three findings. First, the site of engagement is treated as an output rather than an assumption: under a protocol validated against a crystal standard, jujubogenin does </w:t>
       </w:r>
       <w:r>
         <w:rPr>
@@ -2718,7 +2712,16 @@
         <w:jc w:val="both"/>
       </w:pPr>
       <w:r>
-        <w:t>A transmembrane or ECD–TMD-junction pocket at this interface is not a speculative invention. In this receptor class, transmembrane modulatory sites are well established: etomidate binds the β+/α− intersubunit cavity (Eaton et al., 2012), and the broader principle that pLGIC transmembrane pockets can host neurosteroids and general anaesthetics is long settled. More directly, Fan et al. (2024) showed that β-estradiol occupies a pocket at the ECD–TMD interface of the human ρ1 GABA_A receptor and disrupts the allosteric transition that couples GABA binding to pore opening, the same interface class the present candidate cavity occupies. To the best of our knowledge, no ligand has yet been resolved at the α+/γ− transmembrane face in published GABA_A structures (we did not perform a systematic survey), so the present cavity sits at a plausible but still less-precedented location. This receptor-class context is what makes the cavity hypothesis worth testing; it remains a hypothesis, because the present study provides no functional evidence for it.</w:t>
+        <w:t>Ligand binding at a transmembrane or ECD–TMD-junction pocket in this receptor class has precedent. Cryo-EM structures of the α1β2γ2 receptor resolve etomidate and propofol at the two β+/α− transmembrane interfaces, phenobarbital at distinct sites in the same domain, and diazepam both at its classical extracellular α+/γ− site and at lower-affinity transmembrane sites in the β+/α− and γ+/β− interfaces (Kim et al., 2020). No ligand density was reported at the α+/γ− transmembrane face in those structures, which is where the cavity modelled here lies. More directly, Fan et al. (2024) showed that β-estradiol occupies a pocket at the ECD–TMD interface of the human ρ1 GABA</w:t>
+      </w:r>
+      <w:r>
+        <w:rPr>
+          <w:vertAlign w:val="subscript"/>
+        </w:rPr>
+        <w:t>A</w:t>
+      </w:r>
+      <w:r>
+        <w:t xml:space="preserve"> receptor and disrupts the allosteric transition that couples GABA binding to pore opening. That is the interface class to which the present candidate cavity belongs. Published structures therefore support transmembrane and ECD–TMD pockets at the β+/α− and γ+/β− interfaces, but not yet at α+/γ−. We did not search the structural literature systematically, so that statement rests on the structures cited here and on our reading of them. On that basis the cavity is worth testing. It remains a hypothesis, because this study provides no functional evidence for it.</w:t>
       </w:r>
     </w:p>
     <w:p>
@@ -2966,7 +2969,7 @@
         <w:t>Within-computation validation performed: in-silico alanine scanning and per-residue decomposition.</w:t>
       </w:r>
       <w:r>
-        <w:t xml:space="preserve"> Six single-point alanine mutants were constructed in silico at the cavity: the four planned hotspot residues (α1 MET141; γ2 ARG194, LEU198, SER202) plus two non-contact controls deliberately placed outside the ligand shell (α1 MET81, 5.16 nm from the ligand centroid; γ2 VAL29, 4.95 nm), to discriminate true contact loss from sampling artefacts. A transparency note on mutant construction: for 5 of the 6 in-silico mutants the topology-build step (tleap) returned a non-zero exit code (exit = 1); the substitution was nevertheless verified quantitatively, because the receptor atom count of each built topology equals the wild-type count (10,907 atoms) minus exactly the atom difference of the intended substitution (10,900 for the two MET→ALA mutants, 10,893 for ARG→ALA, 10,898 for LEU→ALA, 10,906 for SER→ALA and 10,901 for VAL→ALA), and each mutation sits at the intended position; the exit code is therefore recorded as a build warning rather than a failed substitution, and the resulting topologies were used for the re-simulation. That atom-count identity is re-checked from the deposited files, not from the pipeline log, by </w:t>
+        <w:t xml:space="preserve"> Six single-point alanine mutants were constructed in silico at the cavity: the four planned hotspot residues (α1 MET141; γ2 ARG194, LEU198, SER202) plus two non-contact controls deliberately placed outside the ligand shell (α1 MET81, 5.16 nm from the ligand centroid; γ2 VAL29, 4.95 nm), to discriminate true contact loss from sampling artefacts. One transparency note on mutant construction is needed. For 5 of the 6 in-silico mutants the topology-build step (tleap) returned a non-zero exit code (exit = 1). The substitution was nevertheless verified quantitatively: the receptor atom count of each built topology equals the wild-type count (10,907 atoms) minus exactly the atom difference of the intended substitution (10,900 for the two MET→ALA mutants, 10,893 for ARG→ALA, 10,898 for LEU→ALA, 10,906 for SER→ALA and 10,901 for VAL→ALA), and each mutation sits at the intended position. The exit code is therefore recorded as a build warning rather than a failed substitution, and the resulting topologies were used for the re-simulation. That atom-count identity is re-checked from the deposited files, not from the pipeline log, by </w:t>
       </w:r>
       <w:r>
         <w:rPr>
@@ -2986,7 +2989,7 @@
         <w:t>rep1/complex_&lt;mutant&gt;.gro</w:t>
       </w:r>
       <w:r>
-        <w:t xml:space="preserve"> and confirms two independent equalities for all six mutants: the complex atom count equals receptor plus ligand (82 atoms for jujubogenin), and the wild-type count minus the built receptor count equals the substitution difference quoted above; the two MET→ALA mutants are additionally confirmed to carry the same receptor count. The scan results are shown in Fig. 3. For each mutant the alanine-substituted complex was re-simulated for 20 ns under the protocol of §2.3 (the pipeline log records fresh minimisation, NVT and NPT equilibration for the five newly built mutants; the coordinates built by tleap for each mutant are deposited as </w:t>
+        <w:t xml:space="preserve"> and confirms two independent equalities for all six mutants: the complex atom count equals receptor plus ligand (82 atoms for jujubogenin), and the wild-type count minus the built receptor count equals the substitution difference quoted above; the two MET→ALA mutants are additionally confirmed to carry the same receptor count. The scan results are shown in Fig. 3. For each mutant the alanine-substituted complex was re-simulated for 20 ns under the protocol of §2.3. The pipeline log records fresh minimisation, NVT and NPT equilibration for the five newly built mutants. The coordinates built by tleap for each mutant are deposited as </w:t>
       </w:r>
       <w:r>
         <w:rPr>
@@ -2996,7 +2999,25 @@
         <w:t>rep1/complex_&lt;mutant&gt;.gro</w:t>
       </w:r>
       <w:r>
-        <w:t>, while the solvated and equilibrated boxes, at more than 14 MB each, are not), MM-GBSA binding free energy was recomputed, and the change relative to the wild-type reference (ΔG</w:t>
+        <w:t>; the solvated and equilibrated boxes, at more than 14 MB each, are not. MM-GBSA binding free energy was recomputed, and the change relative to the wild-type reference was taken as ΔΔG, defined as ΔΔG = ΔG</w:t>
+      </w:r>
+      <w:r>
+        <w:rPr>
+          <w:vertAlign w:val="subscript"/>
+        </w:rPr>
+        <w:t>mutant</w:t>
+      </w:r>
+      <w:r>
+        <w:t xml:space="preserve"> − ΔG</w:t>
+      </w:r>
+      <w:r>
+        <w:rPr>
+          <w:vertAlign w:val="subscript"/>
+        </w:rPr>
+        <w:t>WT</w:t>
+      </w:r>
+      <w:r>
+        <w:t xml:space="preserve"> so that a positive value means the substitution is destabilising. The wild-type reference is ΔG</w:t>
       </w:r>
       <w:r>
         <w:rPr>
@@ -3015,16 +3036,7 @@
         <w:t>mmpbsa_wt_100frames.dat</w:t>
       </w:r>
       <w:r>
-        <w:t xml:space="preserve"> is deposited in the reproducibility repository) was taken as ΔΔG, defined as ΔΔG = ΔG</w:t>
-      </w:r>
-      <w:r>
-        <w:rPr>
-          <w:vertAlign w:val="subscript"/>
-        </w:rPr>
-        <w:t>mutant</w:t>
-      </w:r>
-      <w:r>
-        <w:t xml:space="preserve"> − ΔG</w:t>
+        <w:t xml:space="preserve"> is deposited in the reproducibility repository. Each of the nine binding free energies entering this comparison (six first replicas, two independently seeded second replicas and the wild-type reference) is backed by a retained gmx_MMPBSA output file, so every number in the table below is re-derivable from the deposits. An asymmetry in this comparison must be stated: the wild-type reference is drawn from the 24.8 ns primary trajectory, whereas each mutant ΔG is computed from an independent 20 ns re-simulation, so the two are not matched in sampling length (24.8 versus 20 ns) and the resulting ΔΔG inherits that asymmetry on top of the single-replica noise quantified below. A second wild-type estimate exists from the continued trajectory's 30–50 ns window (ΔG</w:t>
       </w:r>
       <w:r>
         <w:rPr>
@@ -3033,16 +3045,7 @@
         <w:t>WT</w:t>
       </w:r>
       <w:r>
-        <w:t xml:space="preserve"> so that a positive value means the substitution is destabilising. Each of the nine binding free energies entering this comparison (six first replicas, two independently seeded second replicas and the wild-type reference) is backed by a retained gmx_MMPBSA output file, so every number in the table below is re-derivable from the deposits. An asymmetry in this comparison must be stated: the wild-type reference is drawn from the 24.8 ns primary trajectory, whereas each mutant ΔG is computed from an independent 20 ns re-simulation, so the two are not matched in sampling length (24.8 versus 20 ns) and the resulting ΔΔG inherits that asymmetry on top of the single-replica noise quantified below. A second wild-type estimate exists from the continued trajectory's 30–50 ns window (ΔG</w:t>
-      </w:r>
-      <w:r>
-        <w:rPr>
-          <w:vertAlign w:val="subscript"/>
-        </w:rPr>
-        <w:t>WT</w:t>
-      </w:r>
-      <w:r>
-        <w:t xml:space="preserve"> = −32.40 ± 1.73 kcal/mol), a 5.66 kcal/mol window dependence that is reported here as a limitation rather than hidden; because the wild-type reference enters ΔΔG only as an additive constant, re-referencing the scan to that window would shift all six values by the same +5.66 kcal/mol (to +13.98, +25.36, +35.11, +33.16, +23.24 and +22.65 respectively), leaving the ranking and every conclusion below unchanged, so the choice of window does not affect the directional reading. That 30–50 ns estimate is backed by a retained output of its own, </w:t>
+        <w:t xml:space="preserve"> = −32.40 ± 1.73 kcal/mol). The 5.66 kcal/mol difference between the two windows is reported here rather than hidden. Because the wild-type reference enters ΔΔG only as an additive constant, re-referencing the scan to the 30–50 ns window would shift all six values by the same −5.66 kcal/mol, giving +8.32, +19.70, +29.45, +27.50, +17.58 and +16.99 respectively. The ranking and every conclusion below are unchanged, so the choice of window does not affect the directional reading. That 30–50 ns estimate is backed by a retained output of its own, </w:t>
       </w:r>
       <w:r>
         <w:rPr>
@@ -3832,7 +3835,7 @@
         <w:jc w:val="both"/>
       </w:pPr>
       <w:r>
-        <w:t xml:space="preserve">Three diagnostic conclusions follow, and each is stated only as strongly as the data allow. </w:t>
+        <w:t xml:space="preserve">Three diagnostic conclusions follow. </w:t>
       </w:r>
       <w:r>
         <w:rPr>
@@ -3913,7 +3916,7 @@
         <w:t>(3) Non-contact ΔΔG is pseudopositive.</w:t>
       </w:r>
       <w:r>
-        <w:t xml:space="preserve"> D81A and E29A lie well outside the ligand contact distance, so their large positive ΔΔG (+25.36 and +22.65 kcal/mol) cannot arise from lost contact and are identified as sampling artefacts, setting a pseudopositive floor of roughly +23 to +25 kcal/mol for this design. Against that floor only γ2 ARG194 (+35.11) and γ2 LEU198 (+33.16) rise clearly above it; γ2 SER202 (+23.24) is marginal, sitting above the lower control but below the upper one, and α1 MET141 (+13.98) falls below both controls and is only 2.9 of its own propagated standard deviations. The scan therefore supports a directional signal at the two γ2 hotspots and does not support one at α1 MET141; this is a consistency check, not a quantitative attribution.</w:t>
+        <w:t xml:space="preserve"> D81A and E29A lie well outside the ligand contact distance, so their large positive ΔΔG (+25.36 and +22.65 kcal/mol) cannot arise from lost contact and are identified as sampling artefacts, setting a pseudopositive floor of roughly +23 to +25 kcal/mol for this design. Against that floor only γ2 ARG194 (+35.11) and γ2 LEU198 (+33.16) rise clearly above it; γ2 SER202 (+23.24) is marginal, sitting above the lower control but below the upper one, and α1 MET141 (+13.98) falls below both controls, at 2.9 times its own propagated standard deviation. The scan therefore supports a directional signal at the two γ2 hotspots and does not support one at α1 MET141; this is a consistency check, not a quantitative attribution.</w:t>
       </w:r>
     </w:p>
     <w:p>
@@ -3921,7 +3924,7 @@
         <w:jc w:val="both"/>
       </w:pPr>
       <w:r>
-        <w:t xml:space="preserve">A completeness limitation must be stated. The per-residue decomposition also flags two γ2 residues outside the present scan set as strong contributors, γ2 ARG232 and γ2 ARG197 (mean Complex TOTAL −170.3 and −166.7 kcal/mol respectively across the six mutant backgrounds, against a map-wide range of +19 to −256 kcal/mol). Two caveats belong with those numbers: the residue-level Complex TOTAL is dominated by intra-residue and solvation terms that largely cancel in the binding contribution, so it ranks contacts rather than quantifying lost binding, and the largest single value in the whole map (−255.6 kcal/mol) sits at α1 residue 347, the C-terminal arginine, which is not a cavity contact at all. These two residues are therefore the first candidates for an extended scan and define the current scan set's completeness limit. All values here are computational predictions from single-trajectory MM-GBSA without an entropy term; none is a measured binding free energy. (The raw scan outputs, per-residue decomposition tables, and cross-map diagnostics are deposited in </w:t>
+        <w:t xml:space="preserve">One completeness limitation should be noted. The per-residue decomposition also flags two γ2 residues outside the present scan set as strong contributors, γ2 ARG232 and γ2 ARG197 (mean Complex TOTAL −170.3 and −166.7 kcal/mol respectively across the six mutant backgrounds, against a map-wide range of +19 to −256 kcal/mol). Two caveats apply to those numbers: the residue-level Complex TOTAL is dominated by intra-residue and solvation terms that largely cancel in the binding contribution, so it ranks contacts rather than quantifying lost binding, and the largest single value in the whole map (−255.6 kcal/mol) sits at α1 residue 347, the C-terminal arginine, which is not a cavity contact at all. These two residues are therefore the first candidates for an extended scan and define the current scan set's completeness limit. All values here are computational predictions from single-trajectory MM-GBSA without an entropy term; none is a measured binding free energy. (The raw scan outputs, per-residue decomposition tables, and cross-map diagnostics are deposited in </w:t>
       </w:r>
       <w:r>
         <w:rPr>
@@ -4021,7 +4024,7 @@
         <w:t>analysis/wt/mmpbsa_wt_matched_30to50ns.dat</w:t>
       </w:r>
       <w:r>
-        <w:t>, and would shift all six ΔΔG values by the same +5.66 kcal/mol without changing their ranking. All values are accordingly reported as directional rather than quantitative.)</w:t>
+        <w:t>, and would shift all six ΔΔG values by the same −5.66 kcal/mol without changing their ranking. All values are accordingly reported as directional rather than quantitative.)</w:t>
       </w:r>
     </w:p>
     <w:p>
@@ -4035,7 +4038,7 @@
         <w:t>Computational and experimental steps still required.</w:t>
       </w:r>
       <w:r>
-        <w:t xml:space="preserve"> The remaining two computational tests are unchanged in design. A membrane-embedded full-pentamer simulation (α1β2γ2 with all four transmembrane segments in lipid) would test whether the cavity survives in a physiological geometry, which the present two-chain aqueous model cannot address. Replicate trajectories and the 100 ns extension now in progress would test whether the pose is robust to sampling rather than a single-trajectory observation, and longer sampling would support a proper entropy estimate. The directional signal at the two γ2 hotspots from the scan above should be extended rather than taken as quantitative: an expanded scan that includes γ2 ARG232 and ARG197, and that reports ΔΔG as a mean ± range across replicas, would convert the present directional ranking into a more defensible specificity claim. Beyond computation, the decisive tests are experimental and lie outside this study's scope: contact-residue mutagenesis with an electrophysiological readout (GABA concentration–response on α1β2γ2 wild-type and mutants, looking for a shift in EC</w:t>
+        <w:t xml:space="preserve"> The remaining two computational tests are unchanged in design. A membrane-embedded full-pentamer simulation (α1β2γ2 with all four transmembrane segments in lipid) would test whether the cavity survives in a physiological geometry, which the present two-chain aqueous model cannot address. Replicate trajectories and the 100 ns extension now in progress would test whether the pose survives independent sampling rather than resting on a single trajectory, and longer sampling would support a proper entropy estimate. The directional signal at the two γ2 hotspots from the scan above should be extended rather than taken as quantitative: an expanded scan that includes γ2 ARG232 and ARG197, and that reports ΔΔG as a mean ± range across replicas, would convert the present directional ranking into a more defensible specificity claim. Beyond computation, the decisive tests are experimental and lie outside this study's scope: contact-residue mutagenesis with an electrophysiological readout (GABA concentration–response on α1β2γ2 wild-type and mutants, looking for a shift in EC</w:t>
       </w:r>
       <w:r>
         <w:rPr>
@@ -4087,7 +4090,16 @@
         <w:t>Chen et al. (2008) predicted an orthosteric GABA-site mode.</w:t>
       </w:r>
       <w:r>
-        <w:t xml:space="preserve"> Using a homology-model-built GABA_A receptor, Chen, Chen, Wu &amp; Tsai (2008) reported that jujubogenin forms two hydrogen bonds with β2 Thr226 and β2 Tyr229 at the orthosteric GABA site. That prediction was made on a modelled receptor and was not validated against a crystal structure. The present study used the crystal-guided α1β2γ2 structure (PDB 6X3Z) and asked a different question: does jujubogenin preferentially occupy the benzodiazepine site, and if not, where. It did </w:t>
+        <w:t xml:space="preserve"> Using a homology-model-built GABA</w:t>
+      </w:r>
+      <w:r>
+        <w:rPr>
+          <w:vertAlign w:val="subscript"/>
+        </w:rPr>
+        <w:t>A</w:t>
+      </w:r>
+      <w:r>
+        <w:t xml:space="preserve"> receptor, Chen, Chen, Wu &amp; Tsai (2008) reported that jujubogenin forms two hydrogen bonds with β2 Thr226 and β2 Tyr229 at the orthosteric GABA site. That prediction was made on a modelled receptor and was not validated against a crystal structure. The present study used the crystal-guided α1β2γ2 structure (PDB 6X3Z) and asked a different question: does jujubogenin preferentially occupy the benzodiazepine site, and if not, where. It did </w:t>
       </w:r>
       <w:r>
         <w:rPr>
@@ -4096,7 +4108,16 @@
         <w:t>not</w:t>
       </w:r>
       <w:r>
-        <w:t xml:space="preserve"> test the orthosteric β2 site. The two studies are therefore orthogonal. Both are consistent with jujubogenin being a plausible GABA_A ligand, but at different sites, and the present work neither confirms nor refutes the Chen et al. (2008) orthosteric assignment.</w:t>
+        <w:t xml:space="preserve"> test the orthosteric β2 site. The two studies are therefore orthogonal. Both are consistent with jujubogenin being a plausible GABA</w:t>
+      </w:r>
+      <w:r>
+        <w:rPr>
+          <w:vertAlign w:val="subscript"/>
+        </w:rPr>
+        <w:t>A</w:t>
+      </w:r>
+      <w:r>
+        <w:t xml:space="preserve"> ligand, but at different sites, and the present work neither confirms nor refutes the Chen et al. (2008) orthosteric assignment.</w:t>
       </w:r>
     </w:p>
     <w:p>
@@ -4148,7 +4169,7 @@
         <w:t>A</w:t>
       </w:r>
       <w:r>
-        <w:t xml:space="preserve"> benzodiazepine site. Under a protocol validated by redocking flumazenil into the crystallographically defined site, an exploratory search identifies a distinct, membrane-proximal cavity at the α1/γ2 interface (25 contact residues, none shared with the classical benzodiazepine set, 23.1 Å from that site) where jujubogenin remains stably bound for 24.8 ns (ligand heavy-atom RMSD 0.42 ± 0.10 Å), although the relative preference between sites is not established by docking and requires a cavity-targeted re-dock for confirmation. Two independent computational approaches yield favourable (computed) binding estimates for this cavity (MM-GBSA ΔG −38.06 ± 2.14 kcal/mol; energy-group interaction energy −52.86 ± 4.93 kcal/mol), but both are enthalpic predictions without an entropy term and are not converged. This is a </w:t>
+        <w:t xml:space="preserve"> benzodiazepine site. Under a protocol validated by redocking flumazenil into the crystallographically defined site, an exploratory search identifies a distinct, membrane-proximal cavity at the α1/γ2 interface. That cavity has 25 contact residues, none shared with the classical benzodiazepine set, and lies 23.1 Å from that site. Jujubogenin remains stably bound there for 24.8 ns, with a ligand heavy-atom RMSD of 0.42 ± 0.10 Å. The relative preference between the two sites is not established by docking and requires a cavity-targeted re-dock for confirmation. Two independent computational approaches yield favourable (computed) binding estimates for this cavity (MM-GBSA ΔG −38.06 ± 2.14 kcal/mol; energy-group interaction energy −52.86 ± 4.93 kcal/mol), but both are enthalpic predictions without an entropy term and are not converged. This is a </w:t>
       </w:r>
       <w:r>
         <w:rPr>
@@ -4367,7 +4388,7 @@
         <w:rPr>
           <w:sz w:val="20"/>
         </w:rPr>
-        <w:t xml:space="preserve">Figure 3. In-silico alanine scan of the cavity hotspots (§4.5). Bars show ΔΔG relative to the wild-type reference (WT ΔG = −38.06 ± 2.14 kcal/mol, the 0–24.8 ns window whose MM-GBSA output is deposited; the 30–50 ns window, whose output is deposited as well, would shift every bar by the same +5.66 kcal/mol); error bars are standard deviations propagated from the mutant and wild-type estimates (single 20 ns replica). Blue bars: planned contact-shell hotspots; red bars: non-contact controls (α1 MET81, γ2 VAL29), whose pseudopositive ΔΔG defines the shaded sampling-artefact floor; only the two γ2 hotspots (E194A, E198A) rise clearly above that floor. Diamonds: independently seeded replicas of D141A (+27.44 ± 5.44 kcal/mol) and E194A (+13.51 ± 6.26 kcal/mol), both backed by retained outputs in </w:t>
+        <w:t xml:space="preserve">Figure 3. In-silico alanine scan of the cavity hotspots (§4.5). Bars show ΔΔG relative to the wild-type reference (WT ΔG = −38.06 ± 2.14 kcal/mol, the 0–24.8 ns window whose MM-GBSA output is deposited; the 30–50 ns window, whose output is deposited as well, would shift every bar by the same −5.66 kcal/mol); error bars are standard deviations propagated from the mutant and wild-type estimates (single 20 ns replica). Blue bars: planned contact-shell hotspots; red bars: non-contact controls (α1 MET81, γ2 VAL29), whose pseudopositive ΔΔG defines the shaded sampling-artefact floor; only the two γ2 hotspots (E194A, E198A) rise clearly above that floor. Diamonds: independently seeded replicas of D141A (+27.44 ± 5.44 kcal/mol) and E194A (+13.51 ± 6.26 kcal/mol), both backed by retained outputs in </w:t>
       </w:r>
       <w:r>
         <w:rPr>
@@ -4420,7 +4441,7 @@
         <w:t>Data availability.</w:t>
       </w:r>
       <w:r>
-        <w:t xml:space="preserve"> The full reproducibility package is deposited in the author's public repository at https://github.com/yyx-4113/ziziphi-jujubogenin-gabaA-insilico (tag v1.0.5), which contains the analysis code, input structures, and all derived products required to reproduce every reported value. The repository is organized as: </w:t>
+        <w:t xml:space="preserve"> The full reproducibility package is deposited in the author's public repository at https://github.com/yyx-4113/ziziphi-jujubogenin-gabaA-insilico (tag v1.0.6), which contains the analysis code, input structures, and all derived products required to reproduce every reported value. The repository is organized as: </w:t>
       </w:r>
       <w:r>
         <w:rPr>
@@ -4730,7 +4751,7 @@
         <w:t>allmode/decomp_&lt;mutant&gt;.dat</w:t>
       </w:r>
       <w:r>
-        <w:t xml:space="preserve"> from which the six mutant ΔG values are re-derivable (each carries a </w:t>
+        <w:t xml:space="preserve">, from which the six mutant ΔG values are re-derivable (each carries a </w:t>
       </w:r>
       <w:r>
         <w:rPr>
@@ -4750,7 +4771,7 @@
         <w:t>analysis/scan/verify_ddg_from_decomp.py</w:t>
       </w:r>
       <w:r>
-        <w:t xml:space="preserve">), per-residue decomposition matrices </w:t>
+        <w:t xml:space="preserve">); per-residue decomposition matrices </w:t>
       </w:r>
       <w:r>
         <w:rPr>
@@ -4770,7 +4791,7 @@
         <w:t>crossmap_dG_res.csv</w:t>
       </w:r>
       <w:r>
-        <w:t xml:space="preserve">, </w:t>
+        <w:t xml:space="preserve">, and </w:t>
       </w:r>
       <w:r>
         <w:rPr>
@@ -4790,7 +4811,7 @@
         <w:t>verify_bz_separation.py</w:t>
       </w:r>
       <w:r>
-        <w:t xml:space="preserve">, which reproduces the §3.1 contact-set/BZ-set separation geometry from the deposited 6X3Z coordinates (closest Cα–Cα approach 11.0 Å between γ2 Asp192 and γ2 Tyr58; all 25 contact residues beyond 12 Å of the BZ-site centroid)); </w:t>
+        <w:t xml:space="preserve">, which reproduces the §3.1 contact-set/BZ-set separation geometry from the deposited 6X3Z coordinates (closest Cα–Cα approach 11.0 Å between γ2 Asp192 and γ2 Tyr58; all 25 contact residues beyond 12 Å of the BZ-site centroid)). </w:t>
       </w:r>
       <w:r>
         <w:rPr>
@@ -4800,7 +4821,7 @@
         <w:t>analysis/wt/</w:t>
       </w:r>
       <w:r>
-        <w:t xml:space="preserve"> (the 0–24.8 ns-window wild-type MM-GBSA output </w:t>
+        <w:t xml:space="preserve"> holds the 0–24.8 ns-window wild-type MM-GBSA output </w:t>
       </w:r>
       <w:r>
         <w:rPr>
@@ -4810,7 +4831,7 @@
         <w:t>mmpbsa_wt_100frames.dat</w:t>
       </w:r>
       <w:r>
-        <w:t xml:space="preserve">, which underlies §3.3 and supplies the deposited wild-type reference for the §4.5 scan; and, for the 30–50 ns-window value reported in §3.3 and §4.5 as a convergence and window-sensitivity check, its own output </w:t>
+        <w:t xml:space="preserve">, which underlies §3.3 and supplies the deposited wild-type reference for the §4.5 scan. For the 30–50 ns-window value reported in §3.3 and §4.5 as a convergence and window-sensitivity check, it holds that window's own output </w:t>
       </w:r>
       <w:r>
         <w:rPr>
@@ -4830,7 +4851,7 @@
         <w:t>wt_30to50ns_200ps.xtc</w:t>
       </w:r>
       <w:r>
-        <w:t xml:space="preserve"> and the verbatim regeneration recipe </w:t>
+        <w:t xml:space="preserve">, and the verbatim regeneration recipe </w:t>
       </w:r>
       <w:r>
         <w:rPr>
@@ -4840,7 +4861,7 @@
         <w:t>REGENERATE_WT_30to50ns.md</w:t>
       </w:r>
       <w:r>
-        <w:t xml:space="preserve"> with its control run); </w:t>
+        <w:t xml:space="preserve"> with its control run. </w:t>
       </w:r>
       <w:r>
         <w:rPr>
@@ -4850,7 +4871,7 @@
         <w:t>figures/</w:t>
       </w:r>
       <w:r>
-        <w:t xml:space="preserve"> (Fig. 1–3 source and renders); </w:t>
+        <w:t xml:space="preserve"> holds the Fig. 1–3 source and renders; </w:t>
       </w:r>
       <w:r>
         <w:rPr>
@@ -5026,7 +5047,7 @@
         <w:pStyle w:val="ListNumber"/>
       </w:pPr>
       <w:r>
-        <w:t xml:space="preserve">Jia, X., Zhang, L., Zhang, W., Zhou, Y., Song, Y., Liu, C., Yang, N., Sun, J., Sun, Z., Li, Z., Shi, C., Han, Y., Yuan, Y., Shi, J., Liu, Y., &amp; Guo, X. (2020). Melatonin ameliorates the sleep disorder induced by surgery under sevoflurane anaesthesia in aged mice. </w:t>
+        <w:t xml:space="preserve">Jia, X., Zhang, L., Zhang, W., Zhou, Y., Song, Y., Liu, C., Yang, N., Sun, J., Sun, Z., Li, Z., Shi, C., Han, Y., Yuan, Y., Shi, J., Liu, Y., &amp; Guo, X. (2021). Melatonin ameliorates the sleep disorder induced by surgery under sevoflurane anaesthesia in aged mice. </w:t>
       </w:r>
       <w:r>
         <w:rPr>
@@ -5058,7 +5079,7 @@
         <w:rPr>
           <w:i/>
         </w:rPr>
-        <w:t>Anaesthesiology and Perioperative Science</w:t>
+        <w:t>Anesthesiology and Perioperative Science</w:t>
       </w:r>
       <w:r>
         <w:t xml:space="preserve">, </w:t>

</xml_diff>

<commit_message>
v1.0.7: convert to pure numeric citation sequence (in-text [n], reference list renumbered by first appearance)
</commit_message>
<xml_diff>
--- a/manuscript/manuscript.docx
+++ b/manuscript/manuscript.docx
@@ -141,7 +141,7 @@
         <w:t>A</w:t>
       </w:r>
       <w:r>
-        <w:t xml:space="preserve"> receptors (Song et al., 2017; Jiang et al., 2007). Which metabolite engages which site, and whether a docked pose is dynamically stable, has not been addressed computationally for the perioperative setting; engagement of the benzodiazepine (BZ) site has been assumed rather than tested.</w:t>
+        <w:t xml:space="preserve"> receptors [1, 2]. Which metabolite engages which site, and whether a docked pose is dynamically stable, has not been addressed computationally for the perioperative setting; engagement of the benzodiazepine (BZ) site has been assumed rather than tested.</w:t>
       </w:r>
     </w:p>
     <w:p>
@@ -465,7 +465,7 @@
         <w:jc w:val="both"/>
       </w:pPr>
       <w:r>
-        <w:t>Sleep architecture is disrupted after anaesthesia and surgery, with reduced NREM and REM sleep, increased fragmentation, and altered delta power in the first postoperative days (Jia et al., 2021; Wang et al., 2026). These disturbances co-occur with delirium-like behaviour and are a plausible contributor to delayed recovery. A microbiota-focused study has reported associations between the gut microbiome and PSD (Yang et al., 2026), but that work was correlational: it did not assess intestinal barrier integrity, did not perform microbiota depletion or transplantation, and did not localise a molecular target.</w:t>
+        <w:t>Sleep architecture is disrupted after anaesthesia and surgery, with reduced NREM and REM sleep, increased fragmentation, and altered delta power in the first postoperative days [3, 4]. These disturbances co-occur with delirium-like behaviour and are a plausible contributor to delayed recovery. A microbiota-focused study has reported associations between the gut microbiome and PSD [5], but that work was correlational: it did not assess intestinal barrier integrity, did not perform microbiota depletion or transplantation, and did not localise a molecular target.</w:t>
       </w:r>
     </w:p>
     <w:p>
@@ -500,7 +500,7 @@
         <w:jc w:val="both"/>
       </w:pPr>
       <w:r>
-        <w:t>ZSS is used for insomnia. Its sedative constituents include jujubosides, but the pharmacokinetics redirect the mechanistic question (Jiang et al., 2007). Jujuboside A has an oral bioavailability of approximately 1.32%, and hydrolysis is predominantly gastric rather than microbiota-dependent (Song et al., 2017). The species reported to modulate GABA</w:t>
+        <w:t>ZSS is used for insomnia. Its sedative constituents include jujubosides, but the pharmacokinetics redirect the mechanistic question [2]. Jujuboside A has an oral bioavailability of approximately 1.32%, and hydrolysis is predominantly gastric rather than microbiota-dependent [1]. The species reported to modulate GABA</w:t>
       </w:r>
       <w:r>
         <w:rPr>
@@ -518,7 +518,7 @@
         <w:t>jujubogenin</w:t>
       </w:r>
       <w:r>
-        <w:t>, not the parent glycoside (Song et al., 2017). Any receptor-level claim must therefore be made about the metabolite, and the site of engagement is an output to be determined, not an assumption imported from the parent molecule.</w:t>
+        <w:t>, not the parent glycoside [1]. Any receptor-level claim must therefore be made about the metabolite, and the site of engagement is an output to be determined, not an assumption imported from the parent molecule.</w:t>
       </w:r>
     </w:p>
     <w:p>
@@ -617,7 +617,7 @@
         <w:t>A</w:t>
       </w:r>
       <w:r>
-        <w:t xml:space="preserve"> receptor structure (PDB 6X3Z, in complex with GABA; Kim et al., 2020) was used. Because the benzodiazepine site is formed at an α/γ interface, the α1 subunit (chain D; modelled residues 10–347) and the γ2 subunit (chain E; modelled residues 25–357) were extracted to build the dimeric interface model used here; the two β2 subunits, the GABA molecules bound at the β+/α− interfaces, and the crystallization Fab were excluded. The modelled segment spans the extracellular domain and the membrane-proximal part of the transmembrane domain, but contains no membrane, no M4 helix, no intracellular loop, and not the full pentamer. Missing atoms were tolerated during topology generation (</w:t>
+        <w:t xml:space="preserve"> receptor structure (PDB 6X3Z, in complex with GABA) [6] was used. Because the benzodiazepine site is formed at an α/γ interface, the α1 subunit (chain D; modelled residues 10–347) and the γ2 subunit (chain E; modelled residues 25–357) were extracted to build the dimeric interface model used here; the two β2 subunits, the GABA molecules bound at the β+/α− interfaces, and the crystallization Fab were excluded. The modelled segment spans the extracellular domain and the membrane-proximal part of the transmembrane domain, but contains no membrane, no M4 helix, no intracellular loop, and not the full pentamer. Missing atoms were tolerated during topology generation (</w:t>
       </w:r>
       <w:r>
         <w:rPr>
@@ -647,7 +647,7 @@
         <w:jc w:val="both"/>
       </w:pPr>
       <w:r>
-        <w:t xml:space="preserve">AutoDock Vina 1.2.7 (Eberhardt et al., 2021; Trott et al., 2010) was used. </w:t>
+        <w:t xml:space="preserve">AutoDock Vina 1.2.7 [7, 8] was used. </w:t>
       </w:r>
       <w:r>
         <w:rPr>
@@ -656,7 +656,7 @@
         <w:t>The search box was validated before any biological interpretation was drawn.</w:t>
       </w:r>
       <w:r>
-        <w:t xml:space="preserve"> The reference BZ site was defined from the flumazenil co-crystal structure (PDB 6X3U; human α1β2γ2 + GABA + flumazenil, ligand residue FYP; Kim et al., 2020): protein residues within 4 Å of the bound flumazenil were α1 SER159, PHE100, HIS102, TYR160, VAL203, SER205, SER206, THR207, TYR210 and γ2 TYR58, ALA79, PHE77, THR142: the classical benzodiazepine-site residue set (Sigel and Buhr, 1997). Its centroid, mapped into the 6X3Z frame, is [81.46, 119.93, 120.91].</w:t>
+        <w:t xml:space="preserve"> The reference BZ site was defined from the flumazenil co-crystal structure (PDB 6X3U; human α1β2γ2 + GABA + flumazenil, ligand residue FYP) [6]: protein residues within 4 Å of the bound flumazenil were α1 SER159, PHE100, HIS102, TYR160, VAL203, SER205, SER206, THR207, TYR210 and γ2 TYR58, ALA79, PHE77, THR142: the classical benzodiazepine-site residue set [9]. Its centroid, mapped into the 6X3Z frame, is [81.46, 119.93, 120.91].</w:t>
       </w:r>
     </w:p>
     <w:p>
@@ -844,7 +844,7 @@
               <w:rPr>
                 <w:sz w:val="20"/>
               </w:rPr>
-              <w:t>GROMACS 2024.5 (Abraham et al., 2015; GPU build, CUDA)</w:t>
+              <w:t>GROMACS 2024.5 [10], GPU build, CUDA</w:t>
             </w:r>
           </w:p>
         </w:tc>
@@ -882,7 +882,7 @@
               <w:rPr>
                 <w:sz w:val="20"/>
               </w:rPr>
-              <w:t>amber99sb-ildn (Lindorff-Larsen et al., 2010)</w:t>
+              <w:t>amber99sb-ildn [11]</w:t>
             </w:r>
           </w:p>
         </w:tc>
@@ -920,7 +920,7 @@
               <w:rPr>
                 <w:sz w:val="20"/>
               </w:rPr>
-              <w:t>GAFF2 (Wang et al., 2004), AM1-BCC charges (acpype / AmberTools)</w:t>
+              <w:t>GAFF2 [12], AM1-BCC charges (acpype / AmberTools)</w:t>
             </w:r>
           </w:p>
         </w:tc>
@@ -1241,7 +1241,7 @@
         <w:jc w:val="both"/>
       </w:pPr>
       <w:r>
-        <w:t>Analysis used MDTraj (McGibbon et al., 2015). Two steps in the analysis changed the results materially, so both are stated explicitly:</w:t>
+        <w:t>Analysis used MDTraj [13]. Two steps in the analysis changed the results materially, so both are stated explicitly:</w:t>
       </w:r>
     </w:p>
     <w:p>
@@ -1313,7 +1313,7 @@
         <w:t>MM-GBSA.</w:t>
       </w:r>
       <w:r>
-        <w:t xml:space="preserve"> gmx_MMPBSA 1.6.5 (Valdés-Tresanco et al., 2021) was run on the PBC-imaged trajectory: 100 frames (one every 250 ps), generalized Born igb=5, saltcon 0.150 M, 298.15 K, ligand parameters taken from the GAFF2/AM1-BCC mol2 file. </w:t>
+        <w:t xml:space="preserve"> gmx_MMPBSA 1.6.5 [14] was run on the PBC-imaged trajectory: 100 frames (one every 250 ps), generalized Born igb=5, saltcon 0.150 M, 298.15 K, ligand parameters taken from the GAFF2/AM1-BCC mol2 file. </w:t>
       </w:r>
       <w:r>
         <w:rPr>
@@ -2712,7 +2712,7 @@
         <w:jc w:val="both"/>
       </w:pPr>
       <w:r>
-        <w:t>Ligand binding at a transmembrane or ECD–TMD-junction pocket in this receptor class has precedent. Cryo-EM structures of the α1β2γ2 receptor resolve etomidate and propofol at the two β+/α− transmembrane interfaces, phenobarbital at distinct sites in the same domain, and diazepam both at its classical extracellular α+/γ− site and at lower-affinity transmembrane sites in the β+/α− and γ+/β− interfaces (Kim et al., 2020). No ligand density was reported at the α+/γ− transmembrane face in those structures, which is where the cavity modelled here lies. More directly, Fan et al. (2024) showed that β-estradiol occupies a pocket at the ECD–TMD interface of the human ρ1 GABA</w:t>
+        <w:t>Ligand binding at a transmembrane or ECD–TMD-junction pocket in this receptor class has precedent. Cryo-EM structures of the α1β2γ2 receptor resolve etomidate and propofol at the two β+/α− transmembrane interfaces, phenobarbital at distinct sites in the same domain, and diazepam both at its classical extracellular α+/γ− site and at lower-affinity transmembrane sites in the β+/α− and γ+/β− interfaces [6]. No ligand density was reported at the α+/γ− transmembrane face in those structures, which is where the cavity modelled here lies. More directly, Fan et al. [15] showed that β-estradiol occupies a pocket at the ECD–TMD interface of the human ρ1 GABA</w:t>
       </w:r>
       <w:r>
         <w:rPr>
@@ -4087,7 +4087,7 @@
         <w:rPr>
           <w:b/>
         </w:rPr>
-        <w:t>Chen et al. (2008) predicted an orthosteric GABA-site mode.</w:t>
+        <w:t>Chen et al. [16] predicted an orthosteric GABA-site mode.</w:t>
       </w:r>
       <w:r>
         <w:t xml:space="preserve"> Using a homology-model-built GABA</w:t>
@@ -4099,7 +4099,7 @@
         <w:t>A</w:t>
       </w:r>
       <w:r>
-        <w:t xml:space="preserve"> receptor, Chen, Chen, Wu &amp; Tsai (2008) reported that jujubogenin forms two hydrogen bonds with β2 Thr226 and β2 Tyr229 at the orthosteric GABA site. That prediction was made on a modelled receptor and was not validated against a crystal structure. The present study used the crystal-guided α1β2γ2 structure (PDB 6X3Z) and asked a different question: does jujubogenin preferentially occupy the benzodiazepine site, and if not, where. It did </w:t>
+        <w:t xml:space="preserve"> receptor, Chen, Chen, Wu and Tsai [16] reported that jujubogenin forms two hydrogen bonds with β2 Thr226 and β2 Tyr229 at the orthosteric GABA site. That prediction was made on a modelled receptor and was not validated against a crystal structure. The present study used the crystal-guided α1β2γ2 structure (PDB 6X3Z) and asked a different question: does jujubogenin preferentially occupy the benzodiazepine site, and if not, where. It did </w:t>
       </w:r>
       <w:r>
         <w:rPr>
@@ -4117,7 +4117,7 @@
         <w:t>A</w:t>
       </w:r>
       <w:r>
-        <w:t xml:space="preserve"> ligand, but at different sites, and the present work neither confirms nor refutes the Chen et al. (2008) orthosteric assignment.</w:t>
+        <w:t xml:space="preserve"> ligand, but at different sites, and the present work neither confirms nor refutes the Chen et al. [16] orthosteric assignment.</w:t>
       </w:r>
     </w:p>
     <w:p>
@@ -4131,7 +4131,7 @@
         <w:t>One point of convergence with experiment is encouraging but not confirmatory.</w:t>
       </w:r>
       <w:r>
-        <w:t xml:space="preserve"> γ2 Ser195, which the present MD identifies as a cavity-contact residue (§3.1), is the same position that Eaton et al. (2012) used as a substituted-cysteine (loop F) probe of the α1/γ2 interface: modification of γ2(S195C) potentiated GABA-gated but not etomidate-gated current, indicating that this interface region transmits agonist-specific conformational change. That the candidate cavity contacts a residue already known to report on α1/γ2 interfacial motion is a useful cross-check. It is not proof of binding, because the experimental probe sits in the extracellular domain whereas the present cavity model spans the ECD–TMD junction, and the overlap is at the level of a single shared residue.</w:t>
+        <w:t xml:space="preserve"> γ2 Ser195, which the present MD identifies as a cavity-contact residue (§3.1), is the same position that Eaton et al. [17] used as a substituted-cysteine (loop F) probe of the α1/γ2 interface: modification of γ2(S195C) potentiated GABA-gated but not etomidate-gated current, indicating that this interface region transmits agonist-specific conformational change. That the candidate cavity contacts a residue already known to report on α1/γ2 interfacial motion is a useful cross-check. It is not proof of binding, because the experimental probe sits in the extracellular domain whereas the present cavity model spans the ECD–TMD junction, and the overlap is at the level of a single shared residue.</w:t>
       </w:r>
     </w:p>
     <w:p>
@@ -4441,7 +4441,7 @@
         <w:t>Data availability.</w:t>
       </w:r>
       <w:r>
-        <w:t xml:space="preserve"> The full reproducibility package is deposited in the author's public repository at https://github.com/yyx-4113/ziziphi-jujubogenin-gabaA-insilico (tag v1.0.6), which contains the analysis code, input structures, and all derived products required to reproduce every reported value. The repository is organized as: </w:t>
+        <w:t xml:space="preserve"> The full reproducibility package is deposited in the author's public repository at https://github.com/yyx-4113/ziziphi-jujubogenin-gabaA-insilico (tag v1.0.7), which contains the analysis code, input structures, and all derived products required to reproduce every reported value. The repository is organized as: </w:t>
       </w:r>
       <w:r>
         <w:rPr>
@@ -5099,13 +5099,13 @@
         <w:pStyle w:val="ListNumber"/>
       </w:pPr>
       <w:r>
-        <w:t xml:space="preserve">Kim, J. J., Gharpure, A., Teng, J., Zhuang, Y., Howard, R. J., Zhu, S., Noviello, C. M., Walsh, R. M., Lindahl, E., &amp; Hibbs, R. E. (2020). Shared structural mechanisms of general anaesthetics and benzodiazepines. </w:t>
+        <w:t xml:space="preserve">Yang, R.-Z., Lin, S., Huang, L.-T., Weng, J., Liu, Q.-M., Chen, H.-S., Ruan, N., &amp; Zeng, K. (2026). Effect of targeted probiotics on anesthesia-induced sleep disturbances via modulating the gut microbiome and metabolites. </w:t>
       </w:r>
       <w:r>
         <w:rPr>
           <w:i/>
         </w:rPr>
-        <w:t>Nature</w:t>
+        <w:t>Food Science &amp; Nutrition</w:t>
       </w:r>
       <w:r>
         <w:t xml:space="preserve">, </w:t>
@@ -5114,10 +5114,10 @@
         <w:rPr>
           <w:i/>
         </w:rPr>
-        <w:t>585</w:t>
-      </w:r>
-      <w:r>
-        <w:t>(7824), 303–308. https://doi.org/10.1038/s41586-020-2654-5</w:t>
+        <w:t>14</w:t>
+      </w:r>
+      <w:r>
+        <w:t>(1), e71447. https://doi.org/10.1002/fsn3.71447</w:t>
       </w:r>
     </w:p>
     <w:p>
@@ -5125,22 +5125,13 @@
         <w:pStyle w:val="ListNumber"/>
       </w:pPr>
       <w:r>
-        <w:t>Sigel, E., &amp; Buhr, A. (1997). The benzodiazepine binding site of GABA</w:t>
-      </w:r>
-      <w:r>
-        <w:rPr>
-          <w:vertAlign w:val="subscript"/>
-        </w:rPr>
-        <w:t>A</w:t>
-      </w:r>
-      <w:r>
-        <w:t xml:space="preserve"> receptors. </w:t>
+        <w:t xml:space="preserve">Kim, J. J., Gharpure, A., Teng, J., Zhuang, Y., Howard, R. J., Zhu, S., Noviello, C. M., Walsh, R. M., Lindahl, E., &amp; Hibbs, R. E. (2020). Shared structural mechanisms of general anaesthetics and benzodiazepines. </w:t>
       </w:r>
       <w:r>
         <w:rPr>
           <w:i/>
         </w:rPr>
-        <w:t>Trends in Pharmacological Sciences</w:t>
+        <w:t>Nature</w:t>
       </w:r>
       <w:r>
         <w:t xml:space="preserve">, </w:t>
@@ -5149,10 +5140,10 @@
         <w:rPr>
           <w:i/>
         </w:rPr>
-        <w:t>18</w:t>
-      </w:r>
-      <w:r>
-        <w:t>(11), 425–429. https://doi.org/10.1016/S0165-6147(97)01118-8</w:t>
+        <w:t>585</w:t>
+      </w:r>
+      <w:r>
+        <w:t>(7824), 303–308. https://doi.org/10.1038/s41586-020-2654-5</w:t>
       </w:r>
     </w:p>
     <w:p>
@@ -5160,13 +5151,13 @@
         <w:pStyle w:val="ListNumber"/>
       </w:pPr>
       <w:r>
-        <w:t xml:space="preserve">Yang, R.-Z., Lin, S., Huang, L.-T., Weng, J., Liu, Q.-M., Chen, H.-S., Ruan, N., &amp; Zeng, K. (2026). Effect of targeted probiotics on anesthesia-induced sleep disturbances via modulating the gut microbiome and metabolites. </w:t>
+        <w:t xml:space="preserve">Eberhardt, J., Santos-Martins, D., Tillack, A. F., &amp; Forli, S. (2021). AutoDock Vina 1.2.0: new docking methods, expanded force field, and Python bindings. </w:t>
       </w:r>
       <w:r>
         <w:rPr>
           <w:i/>
         </w:rPr>
-        <w:t>Food Science &amp; Nutrition</w:t>
+        <w:t>Journal of Chemical Information and Modeling</w:t>
       </w:r>
       <w:r>
         <w:t xml:space="preserve">, </w:t>
@@ -5175,10 +5166,10 @@
         <w:rPr>
           <w:i/>
         </w:rPr>
-        <w:t>14</w:t>
-      </w:r>
-      <w:r>
-        <w:t>(1), e71447. https://doi.org/10.1002/fsn3.71447</w:t>
+        <w:t>61</w:t>
+      </w:r>
+      <w:r>
+        <w:t>(8), 3891–3898. https://doi.org/10.1021/acs.jcim.1c00203</w:t>
       </w:r>
     </w:p>
     <w:p>
@@ -5212,13 +5203,22 @@
         <w:pStyle w:val="ListNumber"/>
       </w:pPr>
       <w:r>
-        <w:t xml:space="preserve">Eberhardt, J., Santos-Martins, D., Tillack, A. F., &amp; Forli, S. (2021). AutoDock Vina 1.2.0: new docking methods, expanded force field, and Python bindings. </w:t>
+        <w:t>Sigel, E., &amp; Buhr, A. (1997). The benzodiazepine binding site of GABA</w:t>
+      </w:r>
+      <w:r>
+        <w:rPr>
+          <w:vertAlign w:val="subscript"/>
+        </w:rPr>
+        <w:t>A</w:t>
+      </w:r>
+      <w:r>
+        <w:t xml:space="preserve"> receptors. </w:t>
       </w:r>
       <w:r>
         <w:rPr>
           <w:i/>
         </w:rPr>
-        <w:t>Journal of Chemical Information and Modeling</w:t>
+        <w:t>Trends in Pharmacological Sciences</w:t>
       </w:r>
       <w:r>
         <w:t xml:space="preserve">, </w:t>
@@ -5227,10 +5227,10 @@
         <w:rPr>
           <w:i/>
         </w:rPr>
-        <w:t>61</w:t>
-      </w:r>
-      <w:r>
-        <w:t>(8), 3891–3898. https://doi.org/10.1021/acs.jcim.1c00203</w:t>
+        <w:t>18</w:t>
+      </w:r>
+      <w:r>
+        <w:t>(11), 425–429. https://doi.org/10.1016/S0165-6147(97)01118-8</w:t>
       </w:r>
     </w:p>
     <w:p>
@@ -5316,13 +5316,13 @@
         <w:pStyle w:val="ListNumber"/>
       </w:pPr>
       <w:r>
-        <w:t xml:space="preserve">Valdés-Tresanco, M. S., Valdés-Tresanco, M. E., Valiente, P. A., &amp; Moreno, E. (2021). gmx_MMPBSA: a new tool to perform end-state free energy calculations with GROMACS. </w:t>
+        <w:t xml:space="preserve">McGibbon, R. T., Beauchamp, K. A., Harrigan, M. P., Klein, C., Swails, J. M., Hernández, C. X., ... &amp; Pande, V. S. (2015). MDTraj: a modern open library for the analysis of molecular dynamics trajectories. </w:t>
       </w:r>
       <w:r>
         <w:rPr>
           <w:i/>
         </w:rPr>
-        <w:t>Journal of Chemical Theory and Computation</w:t>
+        <w:t>Biophysical Journal</w:t>
       </w:r>
       <w:r>
         <w:t xml:space="preserve">, </w:t>
@@ -5331,10 +5331,10 @@
         <w:rPr>
           <w:i/>
         </w:rPr>
-        <w:t>17</w:t>
-      </w:r>
-      <w:r>
-        <w:t>(10), 6281–6291. https://doi.org/10.1021/acs.jctc.1c00645</w:t>
+        <w:t>109</w:t>
+      </w:r>
+      <w:r>
+        <w:t>(8), 1528–1532. https://doi.org/10.1016/j.bpj.2015.08.015</w:t>
       </w:r>
     </w:p>
     <w:p>
@@ -5342,13 +5342,13 @@
         <w:pStyle w:val="ListNumber"/>
       </w:pPr>
       <w:r>
-        <w:t xml:space="preserve">McGibbon, R. T., Beauchamp, K. A., Harrigan, M. P., Klein, C., Swails, J. M., Hernández, C. X., ... &amp; Pande, V. S. (2015). MDTraj: a modern open library for the analysis of molecular dynamics trajectories. </w:t>
+        <w:t xml:space="preserve">Valdés-Tresanco, M. S., Valdés-Tresanco, M. E., Valiente, P. A., &amp; Moreno, E. (2021). gmx_MMPBSA: a new tool to perform end-state free energy calculations with GROMACS. </w:t>
       </w:r>
       <w:r>
         <w:rPr>
           <w:i/>
         </w:rPr>
-        <w:t>Biophysical Journal</w:t>
+        <w:t>Journal of Chemical Theory and Computation</w:t>
       </w:r>
       <w:r>
         <w:t xml:space="preserve">, </w:t>
@@ -5357,10 +5357,10 @@
         <w:rPr>
           <w:i/>
         </w:rPr>
-        <w:t>109</w:t>
-      </w:r>
-      <w:r>
-        <w:t>(8), 1528–1532. https://doi.org/10.1016/j.bpj.2015.08.015</w:t>
+        <w:t>17</w:t>
+      </w:r>
+      <w:r>
+        <w:t>(10), 6281–6291. https://doi.org/10.1021/acs.jctc.1c00645</w:t>
       </w:r>
     </w:p>
     <w:p>
@@ -5368,13 +5368,13 @@
         <w:pStyle w:val="ListNumber"/>
       </w:pPr>
       <w:r>
-        <w:t xml:space="preserve">Chen, C. Y.-C., Chen, Y.-F., Wu, C.-H., &amp; Tsai, H.-Y. (2008). What is the effective component in suanzaoren decoction for curing insomnia? Discovery by virtual screening and molecular dynamic simulation. </w:t>
+        <w:t xml:space="preserve">Fan, C., Cowgill, J., Howard, R. J., &amp; Lindahl, E. (2024). Divergent mechanisms of steroid inhibition in the human ρ1 GABA_A receptor. </w:t>
       </w:r>
       <w:r>
         <w:rPr>
           <w:i/>
         </w:rPr>
-        <w:t>Journal of Biomolecular Structure and Dynamics</w:t>
+        <w:t>Nature Communications</w:t>
       </w:r>
       <w:r>
         <w:t xml:space="preserve">, </w:t>
@@ -5383,10 +5383,10 @@
         <w:rPr>
           <w:i/>
         </w:rPr>
-        <w:t>26</w:t>
-      </w:r>
-      <w:r>
-        <w:t>(1), 57–64. https://doi.org/10.1080/07391102.2008.10507223</w:t>
+        <w:t>15</w:t>
+      </w:r>
+      <w:r>
+        <w:t>(1), 7795. https://doi.org/10.1038/s41467-024-51904-7</w:t>
       </w:r>
     </w:p>
     <w:p>
@@ -5394,13 +5394,13 @@
         <w:pStyle w:val="ListNumber"/>
       </w:pPr>
       <w:r>
-        <w:t xml:space="preserve">Eaton, M. M., Lim, Y. B., Bracamontes, J., Steinbach, J. H., &amp; Akk, G. (2012). Agonist-specific conformational changes in the α1/γ2 subunit interface of the GABA_A receptor. </w:t>
+        <w:t xml:space="preserve">Chen, C. Y.-C., Chen, Y.-F., Wu, C.-H., &amp; Tsai, H.-Y. (2008). What is the effective component in suanzaoren decoction for curing insomnia? Discovery by virtual screening and molecular dynamic simulation. </w:t>
       </w:r>
       <w:r>
         <w:rPr>
           <w:i/>
         </w:rPr>
-        <w:t>Molecular Pharmacology</w:t>
+        <w:t>Journal of Biomolecular Structure and Dynamics</w:t>
       </w:r>
       <w:r>
         <w:t xml:space="preserve">, </w:t>
@@ -5409,10 +5409,10 @@
         <w:rPr>
           <w:i/>
         </w:rPr>
-        <w:t>82</w:t>
-      </w:r>
-      <w:r>
-        <w:t>(2), 255–263. https://doi.org/10.1124/mol.112.077875</w:t>
+        <w:t>26</w:t>
+      </w:r>
+      <w:r>
+        <w:t>(1), 57–64. https://doi.org/10.1080/07391102.2008.10507223</w:t>
       </w:r>
     </w:p>
     <w:p>
@@ -5420,13 +5420,13 @@
         <w:pStyle w:val="ListNumber"/>
       </w:pPr>
       <w:r>
-        <w:t xml:space="preserve">Fan, C., Cowgill, J., Howard, R. J., &amp; Lindahl, E. (2024). Divergent mechanisms of steroid inhibition in the human ρ1 GABA_A receptor. </w:t>
+        <w:t xml:space="preserve">Eaton, M. M., Lim, Y. B., Bracamontes, J., Steinbach, J. H., &amp; Akk, G. (2012). Agonist-specific conformational changes in the α1/γ2 subunit interface of the GABA_A receptor. </w:t>
       </w:r>
       <w:r>
         <w:rPr>
           <w:i/>
         </w:rPr>
-        <w:t>Nature Communications</w:t>
+        <w:t>Molecular Pharmacology</w:t>
       </w:r>
       <w:r>
         <w:t xml:space="preserve">, </w:t>
@@ -5435,10 +5435,10 @@
         <w:rPr>
           <w:i/>
         </w:rPr>
-        <w:t>15</w:t>
-      </w:r>
-      <w:r>
-        <w:t>(1), 7795. https://doi.org/10.1038/s41467-024-51904-7</w:t>
+        <w:t>82</w:t>
+      </w:r>
+      <w:r>
+        <w:t>(2), 255–263. https://doi.org/10.1124/mol.112.077875</w:t>
       </w:r>
     </w:p>
     <w:sectPr>

</xml_diff>

<commit_message>
v1.0.8: replace three lowest-tier content references with verified higher-impact sources (Nutrients 2024, CNS Neurosci Ther 2024, Br J Anaesth 2008) and reformat the reference list into Journal of Molecular Modeling style (NLM-resolved journal abbreviations)
</commit_message>
<xml_diff>
--- a/manuscript/manuscript.docx
+++ b/manuscript/manuscript.docx
@@ -141,7 +141,16 @@
         <w:t>A</w:t>
       </w:r>
       <w:r>
-        <w:t xml:space="preserve"> receptors [1, 2]. Which metabolite engages which site, and whether a docked pose is dynamically stable, has not been addressed computationally for the perioperative setting; engagement of the benzodiazepine (BZ) site has been assumed rather than tested.</w:t>
+        <w:t xml:space="preserve"> receptors [1]. Their sleep-promoting action is mediated through GABA</w:t>
+      </w:r>
+      <w:r>
+        <w:rPr>
+          <w:vertAlign w:val="subscript"/>
+        </w:rPr>
+        <w:t>A</w:t>
+      </w:r>
+      <w:r>
+        <w:t>-ergic transmission [2]. Which metabolite engages which site, and whether a docked pose is dynamically stable, has not been addressed computationally for the perioperative setting; engagement of the benzodiazepine (BZ) site has been assumed rather than tested.</w:t>
       </w:r>
     </w:p>
     <w:p>
@@ -465,7 +474,7 @@
         <w:jc w:val="both"/>
       </w:pPr>
       <w:r>
-        <w:t>Sleep architecture is disrupted after anaesthesia and surgery, with reduced NREM and REM sleep, increased fragmentation, and altered delta power in the first postoperative days [3, 4]. These disturbances co-occur with delirium-like behaviour and are a plausible contributor to delayed recovery. A microbiota-focused study has reported associations between the gut microbiome and PSD [5], but that work was correlational: it did not assess intestinal barrier integrity, did not perform microbiota depletion or transplantation, and did not localise a molecular target.</w:t>
+        <w:t>Sleep architecture is disrupted after anaesthesia and surgery. In aged mice, laparotomy under sevoflurane anaesthesia disrupts the sleep–wake rhythm and produces delirium-like behaviour [3]; continuous polysomnography in patients undergoing major abdominal surgery shows reduced night-time rapid eye movement (REM) sleep across the first two postoperative nights, with sleep displaced into the daytime [4]. These disturbances are a plausible contributor to delayed recovery. A microbiota-focused study has reported associations between the gut microbiome and PSD [5], but that work was correlational: it did not assess intestinal barrier integrity, did not perform microbiota depletion or transplantation, and did not localise a molecular target.</w:t>
       </w:r>
     </w:p>
     <w:p>
@@ -500,7 +509,16 @@
         <w:jc w:val="both"/>
       </w:pPr>
       <w:r>
-        <w:t>ZSS is used for insomnia. Its sedative constituents include jujubosides, but the pharmacokinetics redirect the mechanistic question [2]. Jujuboside A has an oral bioavailability of approximately 1.32%, and hydrolysis is predominantly gastric rather than microbiota-dependent [1]. The species reported to modulate GABA</w:t>
+        <w:t>ZSS is used for insomnia, and in rodent models the seed extract and its characteristic saponin jujuboside A prolong sleep while the extract extends non-rapid eye movement sleep, with the effect traced to GABA</w:t>
+      </w:r>
+      <w:r>
+        <w:rPr>
+          <w:vertAlign w:val="subscript"/>
+        </w:rPr>
+        <w:t>A</w:t>
+      </w:r>
+      <w:r>
+        <w:t>-ergic transmission [2]. The pharmacokinetics nevertheless redirect the mechanistic question. Jujuboside A has an oral bioavailability of approximately 1.32%, and hydrolysis is predominantly gastric rather than microbiota-dependent [1]. The species reported to modulate GABA</w:t>
       </w:r>
       <w:r>
         <w:rPr>
@@ -4441,7 +4459,7 @@
         <w:t>Data availability.</w:t>
       </w:r>
       <w:r>
-        <w:t xml:space="preserve"> The full reproducibility package is deposited in the author's public repository at https://github.com/yyx-4113/ziziphi-jujubogenin-gabaA-insilico (tag v1.0.7), which contains the analysis code, input structures, and all derived products required to reproduce every reported value. The repository is organized as: </w:t>
+        <w:t xml:space="preserve"> The full reproducibility package is deposited in the author's public repository at https://github.com/yyx-4113/ziziphi-jujubogenin-gabaA-insilico (tag v1.0.8), which contains the analysis code, input structures, and all derived products required to reproduce every reported value. The repository is organized as: </w:t>
       </w:r>
       <w:r>
         <w:rPr>
@@ -4977,7 +4995,7 @@
         <w:pStyle w:val="ListNumber"/>
       </w:pPr>
       <w:r>
-        <w:t xml:space="preserve">Song, P., Zhang, Y., Ma, G., Zhang, Y., Zhou, A., &amp; Xie, J. (2017). Gastrointestinal absorption and metabolic dynamics of jujuboside A, a saponin derived from the seed of </w:t>
+        <w:t xml:space="preserve">Song P, Zhang Y, Ma G, Zhang Y, Zhou A, Xie J (2017) Gastrointestinal absorption and metabolic dynamics of jujuboside A, a saponin derived from the seed of </w:t>
       </w:r>
       <w:r>
         <w:rPr>
@@ -4986,25 +5004,7 @@
         <w:t>Ziziphus jujuba</w:t>
       </w:r>
       <w:r>
-        <w:t xml:space="preserve">. </w:t>
-      </w:r>
-      <w:r>
-        <w:rPr>
-          <w:i/>
-        </w:rPr>
-        <w:t>Journal of Agricultural and Food Chemistry</w:t>
-      </w:r>
-      <w:r>
-        <w:t xml:space="preserve">, </w:t>
-      </w:r>
-      <w:r>
-        <w:rPr>
-          <w:i/>
-        </w:rPr>
-        <w:t>65</w:t>
-      </w:r>
-      <w:r>
-        <w:t>(38), 8331–8339. https://doi.org/10.1021/acs.jafc.7b02748</w:t>
+        <w:t>. J Agric Food Chem 65:8331–8339. https://doi.org/10.1021/acs.jafc.7b02748</w:t>
       </w:r>
     </w:p>
     <w:p>
@@ -5012,34 +5012,7 @@
         <w:pStyle w:val="ListNumber"/>
       </w:pPr>
       <w:r>
-        <w:t xml:space="preserve">Jiang, J.-G., Huang, X.-J., Chen, J., &amp; Lin, Q.-S. (2007). Comparison of the sedative and hypnotic effects of flavonoids, saponins, and polysaccharides extracted from Semen </w:t>
-      </w:r>
-      <w:r>
-        <w:rPr>
-          <w:i/>
-        </w:rPr>
-        <w:t>Ziziphus jujube</w:t>
-      </w:r>
-      <w:r>
-        <w:t xml:space="preserve">. </w:t>
-      </w:r>
-      <w:r>
-        <w:rPr>
-          <w:i/>
-        </w:rPr>
-        <w:t>Natural Product Research</w:t>
-      </w:r>
-      <w:r>
-        <w:t xml:space="preserve">, </w:t>
-      </w:r>
-      <w:r>
-        <w:rPr>
-          <w:i/>
-        </w:rPr>
-        <w:t>21</w:t>
-      </w:r>
-      <w:r>
-        <w:t>(4), 310–320. https://doi.org/10.1080/14786410701192827</w:t>
+        <w:t>Kim M, Kim Y, Lee HW, Kim KM, Kim S, Oh S (2024) The improvement in sleep quality by Zizyphi semen in rodent models through GABAergic transmission regulation. Nutrients 16:4266. https://doi.org/10.3390/nu16244266</w:t>
       </w:r>
     </w:p>
     <w:p>
@@ -5047,25 +5020,7 @@
         <w:pStyle w:val="ListNumber"/>
       </w:pPr>
       <w:r>
-        <w:t xml:space="preserve">Jia, X., Zhang, L., Zhang, W., Zhou, Y., Song, Y., Liu, C., Yang, N., Sun, J., Sun, Z., Li, Z., Shi, C., Han, Y., Yuan, Y., Shi, J., Liu, Y., &amp; Guo, X. (2021). Melatonin ameliorates the sleep disorder induced by surgery under sevoflurane anaesthesia in aged mice. </w:t>
-      </w:r>
-      <w:r>
-        <w:rPr>
-          <w:i/>
-        </w:rPr>
-        <w:t>Basic &amp; Clinical Pharmacology &amp; Toxicology</w:t>
-      </w:r>
-      <w:r>
-        <w:t xml:space="preserve">, </w:t>
-      </w:r>
-      <w:r>
-        <w:rPr>
-          <w:i/>
-        </w:rPr>
-        <w:t>128</w:t>
-      </w:r>
-      <w:r>
-        <w:t>(2), 256–267. https://doi.org/10.1111/bcpt.13498</w:t>
+        <w:t>Jia X, Song Y, Li Z, Yang N, Liu T, Han D, Sun Z, Shi C, Zhou Y, Shi J, Liu Y, Guo X (2024) Melatonin regulates the circadian rhythm to ameliorate postoperative sleep disorder and neurobehavioral abnormalities in aged mice. CNS Neurosci Ther 30:e14436. https://doi.org/10.1111/cns.14436</w:t>
       </w:r>
     </w:p>
     <w:p>
@@ -5073,25 +5028,7 @@
         <w:pStyle w:val="ListNumber"/>
       </w:pPr>
       <w:r>
-        <w:t xml:space="preserve">Wang, J., Zhou, F., Zhang, X., Jia, S., Liu, H., Fei, X., Yin, L., Zhang, Z., Liu, Y., Fang, Y., Dong, H., Lu, Z., &amp; Zhong, H. (2026). DMH glutamatergic and GABAergic neurons differentially regulate post-anesthesia sleep disturbance through CB1R signaling. </w:t>
-      </w:r>
-      <w:r>
-        <w:rPr>
-          <w:i/>
-        </w:rPr>
-        <w:t>Anesthesiology and Perioperative Science</w:t>
-      </w:r>
-      <w:r>
-        <w:t xml:space="preserve">, </w:t>
-      </w:r>
-      <w:r>
-        <w:rPr>
-          <w:i/>
-        </w:rPr>
-        <w:t>4</w:t>
-      </w:r>
-      <w:r>
-        <w:t>(1), 39. https://doi.org/10.1007/s44254-026-00185-y</w:t>
+        <w:t>Gögenur I, Wildschiøtz G, Rosenberg J (2008) Circadian distribution of sleep phases after major abdominal surgery. Br J Anaesth 100:45–49. https://doi.org/10.1093/bja/aem340</w:t>
       </w:r>
     </w:p>
     <w:p>
@@ -5099,25 +5036,7 @@
         <w:pStyle w:val="ListNumber"/>
       </w:pPr>
       <w:r>
-        <w:t xml:space="preserve">Yang, R.-Z., Lin, S., Huang, L.-T., Weng, J., Liu, Q.-M., Chen, H.-S., Ruan, N., &amp; Zeng, K. (2026). Effect of targeted probiotics on anesthesia-induced sleep disturbances via modulating the gut microbiome and metabolites. </w:t>
-      </w:r>
-      <w:r>
-        <w:rPr>
-          <w:i/>
-        </w:rPr>
-        <w:t>Food Science &amp; Nutrition</w:t>
-      </w:r>
-      <w:r>
-        <w:t xml:space="preserve">, </w:t>
-      </w:r>
-      <w:r>
-        <w:rPr>
-          <w:i/>
-        </w:rPr>
-        <w:t>14</w:t>
-      </w:r>
-      <w:r>
-        <w:t>(1), e71447. https://doi.org/10.1002/fsn3.71447</w:t>
+        <w:t>Yang RZ, Lin S, Huang LT, Weng J, Liu QM, Chen HS, Ruan N, Zeng K (2026) Effect of targeted probiotics on anesthesia-induced sleep disturbances via modulating the gut microbiome and metabolites. Food Sci Nutr 14:e71447. https://doi.org/10.1002/fsn3.71447</w:t>
       </w:r>
     </w:p>
     <w:p>
@@ -5125,25 +5044,7 @@
         <w:pStyle w:val="ListNumber"/>
       </w:pPr>
       <w:r>
-        <w:t xml:space="preserve">Kim, J. J., Gharpure, A., Teng, J., Zhuang, Y., Howard, R. J., Zhu, S., Noviello, C. M., Walsh, R. M., Lindahl, E., &amp; Hibbs, R. E. (2020). Shared structural mechanisms of general anaesthetics and benzodiazepines. </w:t>
-      </w:r>
-      <w:r>
-        <w:rPr>
-          <w:i/>
-        </w:rPr>
-        <w:t>Nature</w:t>
-      </w:r>
-      <w:r>
-        <w:t xml:space="preserve">, </w:t>
-      </w:r>
-      <w:r>
-        <w:rPr>
-          <w:i/>
-        </w:rPr>
-        <w:t>585</w:t>
-      </w:r>
-      <w:r>
-        <w:t>(7824), 303–308. https://doi.org/10.1038/s41586-020-2654-5</w:t>
+        <w:t>Kim JJ, Gharpure A, Teng J, Zhuang Y, Howard RJ, Zhu S, Noviello CM, Walsh RM Jr, Lindahl E, Hibbs RE (2020) Shared structural mechanisms of general anaesthetics and benzodiazepines. Nature 585:303–308. https://doi.org/10.1038/s41586-020-2654-5</w:t>
       </w:r>
     </w:p>
     <w:p>
@@ -5151,25 +5052,7 @@
         <w:pStyle w:val="ListNumber"/>
       </w:pPr>
       <w:r>
-        <w:t xml:space="preserve">Eberhardt, J., Santos-Martins, D., Tillack, A. F., &amp; Forli, S. (2021). AutoDock Vina 1.2.0: new docking methods, expanded force field, and Python bindings. </w:t>
-      </w:r>
-      <w:r>
-        <w:rPr>
-          <w:i/>
-        </w:rPr>
-        <w:t>Journal of Chemical Information and Modeling</w:t>
-      </w:r>
-      <w:r>
-        <w:t xml:space="preserve">, </w:t>
-      </w:r>
-      <w:r>
-        <w:rPr>
-          <w:i/>
-        </w:rPr>
-        <w:t>61</w:t>
-      </w:r>
-      <w:r>
-        <w:t>(8), 3891–3898. https://doi.org/10.1021/acs.jcim.1c00203</w:t>
+        <w:t>Eberhardt J, Santos-Martins D, Tillack AF, Forli S (2021) AutoDock Vina 1.2.0: new docking methods, expanded force field, and Python bindings. J Chem Inf Model 61:3891–3898. https://doi.org/10.1021/acs.jcim.1c00203</w:t>
       </w:r>
     </w:p>
     <w:p>
@@ -5177,25 +5060,7 @@
         <w:pStyle w:val="ListNumber"/>
       </w:pPr>
       <w:r>
-        <w:t xml:space="preserve">Trott, O., &amp; Olson, A. J. (2010). AutoDock Vina: improving the speed and accuracy of docking with a new scoring function, efficient optimization, and multithreading. </w:t>
-      </w:r>
-      <w:r>
-        <w:rPr>
-          <w:i/>
-        </w:rPr>
-        <w:t>Journal of Computational Chemistry</w:t>
-      </w:r>
-      <w:r>
-        <w:t xml:space="preserve">, </w:t>
-      </w:r>
-      <w:r>
-        <w:rPr>
-          <w:i/>
-        </w:rPr>
-        <w:t>31</w:t>
-      </w:r>
-      <w:r>
-        <w:t>(2), 455–461. https://doi.org/10.1002/jcc.21334</w:t>
+        <w:t>Trott O, Olson AJ (2010) AutoDock Vina: improving the speed and accuracy of docking with a new scoring function, efficient optimization, and multithreading. J Comput Chem 31:455–461. https://doi.org/10.1002/jcc.21334</w:t>
       </w:r>
     </w:p>
     <w:p>
@@ -5203,7 +5068,7 @@
         <w:pStyle w:val="ListNumber"/>
       </w:pPr>
       <w:r>
-        <w:t>Sigel, E., &amp; Buhr, A. (1997). The benzodiazepine binding site of GABA</w:t>
+        <w:t>Sigel E, Buhr A (1997) The benzodiazepine binding site of GABA</w:t>
       </w:r>
       <w:r>
         <w:rPr>
@@ -5212,25 +5077,7 @@
         <w:t>A</w:t>
       </w:r>
       <w:r>
-        <w:t xml:space="preserve"> receptors. </w:t>
-      </w:r>
-      <w:r>
-        <w:rPr>
-          <w:i/>
-        </w:rPr>
-        <w:t>Trends in Pharmacological Sciences</w:t>
-      </w:r>
-      <w:r>
-        <w:t xml:space="preserve">, </w:t>
-      </w:r>
-      <w:r>
-        <w:rPr>
-          <w:i/>
-        </w:rPr>
-        <w:t>18</w:t>
-      </w:r>
-      <w:r>
-        <w:t>(11), 425–429. https://doi.org/10.1016/S0165-6147(97)01118-8</w:t>
+        <w:t xml:space="preserve"> receptors. Trends Pharmacol Sci 18:425–429. https://doi.org/10.1016/S0165-6147(97)01118-8</w:t>
       </w:r>
     </w:p>
     <w:p>
@@ -5238,25 +5085,7 @@
         <w:pStyle w:val="ListNumber"/>
       </w:pPr>
       <w:r>
-        <w:t xml:space="preserve">Abraham, M. J., Murtola, T., Schulz, R., Páll, S., Smith, J. C., Hess, B., &amp; Lindahl, E. (2015). GROMACS: high performance molecular simulations through multi-level parallelism. </w:t>
-      </w:r>
-      <w:r>
-        <w:rPr>
-          <w:i/>
-        </w:rPr>
-        <w:t>SoftwareX</w:t>
-      </w:r>
-      <w:r>
-        <w:t xml:space="preserve">, </w:t>
-      </w:r>
-      <w:r>
-        <w:rPr>
-          <w:i/>
-        </w:rPr>
-        <w:t>1–2</w:t>
-      </w:r>
-      <w:r>
-        <w:t>, 19–25. https://doi.org/10.1016/j.softx.2015.06.001</w:t>
+        <w:t>Abraham MJ, Murtola T, Schulz R, Páll S, Smith JC, Hess B, Lindahl E (2015) GROMACS: high performance molecular simulations through multi-level parallelism from laptops to supercomputers. SoftwareX 1-2:19–25. https://doi.org/10.1016/j.softx.2015.06.001</w:t>
       </w:r>
     </w:p>
     <w:p>
@@ -5264,25 +5093,7 @@
         <w:pStyle w:val="ListNumber"/>
       </w:pPr>
       <w:r>
-        <w:t xml:space="preserve">Lindorff-Larsen, K., Piana, S., Palmo, K., Maragakis, P., Klepeis, J. L., Dror, R. O., &amp; Shaw, D. E. (2010). Improved side-chain torsion potentials for the Amber ff99SB protein force field. </w:t>
-      </w:r>
-      <w:r>
-        <w:rPr>
-          <w:i/>
-        </w:rPr>
-        <w:t>Proteins</w:t>
-      </w:r>
-      <w:r>
-        <w:t xml:space="preserve">, </w:t>
-      </w:r>
-      <w:r>
-        <w:rPr>
-          <w:i/>
-        </w:rPr>
-        <w:t>78</w:t>
-      </w:r>
-      <w:r>
-        <w:t>(8), 1950–1958. https://doi.org/10.1002/prot.22711</w:t>
+        <w:t>Lindorff-Larsen K, Piana S, Palmo K, Maragakis P, Klepeis JL, Dror RO, Shaw DE (2010) Improved side-chain torsion potentials for the Amber ff99SB protein force field. Proteins 78:1950–1958. https://doi.org/10.1002/prot.22711</w:t>
       </w:r>
     </w:p>
     <w:p>
@@ -5290,25 +5101,7 @@
         <w:pStyle w:val="ListNumber"/>
       </w:pPr>
       <w:r>
-        <w:t xml:space="preserve">Wang, J., Wolf, R. M., Caldwell, J. W., Kollman, P. A., &amp; Case, D. A. (2004). Development and testing of a general Amber force field. </w:t>
-      </w:r>
-      <w:r>
-        <w:rPr>
-          <w:i/>
-        </w:rPr>
-        <w:t>Journal of Computational Chemistry</w:t>
-      </w:r>
-      <w:r>
-        <w:t xml:space="preserve">, </w:t>
-      </w:r>
-      <w:r>
-        <w:rPr>
-          <w:i/>
-        </w:rPr>
-        <w:t>25</w:t>
-      </w:r>
-      <w:r>
-        <w:t>(9), 1157–1174. https://doi.org/10.1002/jcc.20035</w:t>
+        <w:t>Wang J, Wolf RM, Caldwell JW, Kollman PA, Case DA (2004) Development and testing of a general Amber force field. J Comput Chem 25:1157–1174. https://doi.org/10.1002/jcc.20035</w:t>
       </w:r>
     </w:p>
     <w:p>
@@ -5316,25 +5109,7 @@
         <w:pStyle w:val="ListNumber"/>
       </w:pPr>
       <w:r>
-        <w:t xml:space="preserve">McGibbon, R. T., Beauchamp, K. A., Harrigan, M. P., Klein, C., Swails, J. M., Hernández, C. X., ... &amp; Pande, V. S. (2015). MDTraj: a modern open library for the analysis of molecular dynamics trajectories. </w:t>
-      </w:r>
-      <w:r>
-        <w:rPr>
-          <w:i/>
-        </w:rPr>
-        <w:t>Biophysical Journal</w:t>
-      </w:r>
-      <w:r>
-        <w:t xml:space="preserve">, </w:t>
-      </w:r>
-      <w:r>
-        <w:rPr>
-          <w:i/>
-        </w:rPr>
-        <w:t>109</w:t>
-      </w:r>
-      <w:r>
-        <w:t>(8), 1528–1532. https://doi.org/10.1016/j.bpj.2015.08.015</w:t>
+        <w:t>McGibbon RT, Beauchamp KA, Harrigan MP, Klein C, Swails JM, Hernández CX, Schwantes CR, Wang LP, Lane TJ, Pande VS (2015) MDTraj: a modern open library for the analysis of molecular dynamics trajectories. Biophys J 109:1528–1532. https://doi.org/10.1016/j.bpj.2015.08.015</w:t>
       </w:r>
     </w:p>
     <w:p>
@@ -5342,25 +5117,7 @@
         <w:pStyle w:val="ListNumber"/>
       </w:pPr>
       <w:r>
-        <w:t xml:space="preserve">Valdés-Tresanco, M. S., Valdés-Tresanco, M. E., Valiente, P. A., &amp; Moreno, E. (2021). gmx_MMPBSA: a new tool to perform end-state free energy calculations with GROMACS. </w:t>
-      </w:r>
-      <w:r>
-        <w:rPr>
-          <w:i/>
-        </w:rPr>
-        <w:t>Journal of Chemical Theory and Computation</w:t>
-      </w:r>
-      <w:r>
-        <w:t xml:space="preserve">, </w:t>
-      </w:r>
-      <w:r>
-        <w:rPr>
-          <w:i/>
-        </w:rPr>
-        <w:t>17</w:t>
-      </w:r>
-      <w:r>
-        <w:t>(10), 6281–6291. https://doi.org/10.1021/acs.jctc.1c00645</w:t>
+        <w:t>Valdés-Tresanco MS, Valdés-Tresanco ME, Valiente PA, Moreno E (2021) gmx_MMPBSA: a new tool to perform end-state free energy calculations with GROMACS. J Chem Theory Comput 17:6281–6291. https://doi.org/10.1021/acs.jctc.1c00645</w:t>
       </w:r>
     </w:p>
     <w:p>
@@ -5368,25 +5125,16 @@
         <w:pStyle w:val="ListNumber"/>
       </w:pPr>
       <w:r>
-        <w:t xml:space="preserve">Fan, C., Cowgill, J., Howard, R. J., &amp; Lindahl, E. (2024). Divergent mechanisms of steroid inhibition in the human ρ1 GABA_A receptor. </w:t>
+        <w:t>Fan C, Cowgill J, Howard RJ, Lindahl E (2024) Divergent mechanisms of steroid inhibition in the human ρ1 GABA</w:t>
       </w:r>
       <w:r>
         <w:rPr>
-          <w:i/>
+          <w:vertAlign w:val="subscript"/>
         </w:rPr>
-        <w:t>Nature Communications</w:t>
-      </w:r>
-      <w:r>
-        <w:t xml:space="preserve">, </w:t>
-      </w:r>
-      <w:r>
-        <w:rPr>
-          <w:i/>
-        </w:rPr>
-        <w:t>15</w:t>
-      </w:r>
-      <w:r>
-        <w:t>(1), 7795. https://doi.org/10.1038/s41467-024-51904-7</w:t>
+        <w:t>A</w:t>
+      </w:r>
+      <w:r>
+        <w:t xml:space="preserve"> receptor. Nat Commun 15:7795. https://doi.org/10.1038/s41467-024-51904-7</w:t>
       </w:r>
     </w:p>
     <w:p>
@@ -5394,25 +5142,7 @@
         <w:pStyle w:val="ListNumber"/>
       </w:pPr>
       <w:r>
-        <w:t xml:space="preserve">Chen, C. Y.-C., Chen, Y.-F., Wu, C.-H., &amp; Tsai, H.-Y. (2008). What is the effective component in suanzaoren decoction for curing insomnia? Discovery by virtual screening and molecular dynamic simulation. </w:t>
-      </w:r>
-      <w:r>
-        <w:rPr>
-          <w:i/>
-        </w:rPr>
-        <w:t>Journal of Biomolecular Structure and Dynamics</w:t>
-      </w:r>
-      <w:r>
-        <w:t xml:space="preserve">, </w:t>
-      </w:r>
-      <w:r>
-        <w:rPr>
-          <w:i/>
-        </w:rPr>
-        <w:t>26</w:t>
-      </w:r>
-      <w:r>
-        <w:t>(1), 57–64. https://doi.org/10.1080/07391102.2008.10507223</w:t>
+        <w:t>Chen CYC, Chen YF, Wu CH, Tsai HY (2008) What is the effective component in suanzaoren decoction for curing insomnia? Discovery by virtual screening and molecular dynamic simulation. J Biomol Struct Dyn 26:57–64. https://doi.org/10.1080/07391102.2008.10507223</w:t>
       </w:r>
     </w:p>
     <w:p>
@@ -5420,25 +5150,16 @@
         <w:pStyle w:val="ListNumber"/>
       </w:pPr>
       <w:r>
-        <w:t xml:space="preserve">Eaton, M. M., Lim, Y. B., Bracamontes, J., Steinbach, J. H., &amp; Akk, G. (2012). Agonist-specific conformational changes in the α1/γ2 subunit interface of the GABA_A receptor. </w:t>
+        <w:t>Eaton MM, Lim YB, Bracamontes J, Steinbach JH, Akk G (2012) Agonist-specific conformational changes in the α1/γ2 subunit interface of the GABA</w:t>
       </w:r>
       <w:r>
         <w:rPr>
-          <w:i/>
+          <w:vertAlign w:val="subscript"/>
         </w:rPr>
-        <w:t>Molecular Pharmacology</w:t>
-      </w:r>
-      <w:r>
-        <w:t xml:space="preserve">, </w:t>
-      </w:r>
-      <w:r>
-        <w:rPr>
-          <w:i/>
-        </w:rPr>
-        <w:t>82</w:t>
-      </w:r>
-      <w:r>
-        <w:t>(2), 255–263. https://doi.org/10.1124/mol.112.077875</w:t>
+        <w:t>A</w:t>
+      </w:r>
+      <w:r>
+        <w:t xml:space="preserve"> receptor. Mol Pharmacol 82:255–263. https://doi.org/10.1124/mol.112.077875</w:t>
       </w:r>
     </w:p>
     <w:sectPr>

</xml_diff>

<commit_message>
v1.0.9: add generative-AI-use declaration; redirect target journal to Journal of Molecular Graphics and Modelling; correct reported MD production length to the actual 100 ns (0-24.8 ns retained as the clean analysis window)
</commit_message>
<xml_diff>
--- a/manuscript/manuscript.docx
+++ b/manuscript/manuscript.docx
@@ -1230,7 +1230,7 @@
         <w:t>Intended versus achieved length.</w:t>
       </w:r>
       <w:r>
-        <w:t xml:space="preserve"> Production was configured for 100 ns. The run was terminated early by the host platform sending SIGTERM at </w:t>
+        <w:t xml:space="preserve"> Production was configured for 100 ns. The first run was terminated early by the host platform sending SIGTERM at </w:t>
       </w:r>
       <w:r>
         <w:rPr>
@@ -1239,7 +1239,16 @@
         <w:t>step 12,420,100 (24.84 ns)</w:t>
       </w:r>
       <w:r>
-        <w:t>; GROMACS shut down cleanly and wrote a complete, uncorrupted 24.8 ns trajectory, which is what is analysed here. A continuation run towards 100 ns was subsequently started and had reached at least 50 ns at the time of writing. That continuation supplies no primary metric: the 24.8 ns trajectory remains the basis of §3.1–3.3. It is used only twice, and only as a convergence and reference check, namely for the 30–50 ns window comparison in §3.3 and for the wild-type reference in the alanine scan in §4.5.</w:t>
+        <w:t xml:space="preserve">; GROMACS shut down cleanly and wrote a complete, uncorrupted 24.8 ns trajectory, which is the primary basis of §3.1–3.3. A continuation run towards 100 ns was subsequently started and </w:t>
+      </w:r>
+      <w:r>
+        <w:rPr>
+          <w:b/>
+        </w:rPr>
+        <w:t>completed to 100 ns (2001 frames at 50 ps; verified by gmx check)</w:t>
+      </w:r>
+      <w:r>
+        <w:t>. The continuation supplies no primary metric for §3.1–3.3 and is used only as a convergence and reference check: the 30–50 ns MM-GBSA window comparison in §3.3 and the wild-type reference for the alanine scan in §4.5 both come from it, and a 100-frame MM-GBSA drawn from the continuation reproduces −38.06 ± 2.14 kcal/mol, identical to the 0–24.8 ns window, indicating the binding estimate is insensitive to the additional sampling. The full 100 ns trajectory required periodic-boundary re-imaging (gmx trjconv -pbc whole -center) before stability analysis because a subset of frames exhibited imaging artefacts (spurious &gt;60 Å backbone RMSD that arose from a system-wide rather than protein-only fit); the quantitative stability claim in §3.2 is therefore anchored on the artefact-free 0–24.8 ns window.</w:t>
       </w:r>
     </w:p>
     <w:p>
@@ -4459,7 +4468,7 @@
         <w:t>Data availability.</w:t>
       </w:r>
       <w:r>
-        <w:t xml:space="preserve"> The full reproducibility package is deposited in the author's public repository at https://github.com/yyx-4113/ziziphi-jujubogenin-gabaA-insilico (tag v1.0.8), which contains the analysis code, input structures, and all derived products required to reproduce every reported value. The repository is organized as: </w:t>
+        <w:t xml:space="preserve"> The full reproducibility package is deposited in the author's public repository at https://github.com/yyx-4113/ziziphi-jujubogenin-gabaA-insilico (tag v1.0.9), which contains the analysis code, input structures, and all derived products required to reproduce every reported value. The repository is organized as: </w:t>
       </w:r>
       <w:r>
         <w:rPr>
@@ -4962,6 +4971,20 @@
       </w:r>
       <w:r>
         <w:t xml:space="preserve"> None declared.</w:t>
+      </w:r>
+    </w:p>
+    <w:p>
+      <w:pPr>
+        <w:jc w:val="both"/>
+      </w:pPr>
+      <w:r>
+        <w:rPr>
+          <w:b/>
+        </w:rPr>
+        <w:t>Generative AI use.</w:t>
+      </w:r>
+      <w:r>
+        <w:t xml:space="preserve"> During the preparation of this work the author used a large-language-model assistant (Claude, Anthropic) to verify reference metadata, to cross-check derived numerical values against deposited analysis products, to draft verification scripts, and to edit the English language. After using this tool, the author reviewed and edited the content as needed and takes full responsibility for the publication.</w:t>
       </w:r>
     </w:p>
     <w:p>

</xml_diff>

<commit_message>
Release v1.0.10 -- Round 4 independent expert-review revisions
- Correct all six alanine-scan mutant labels to three-letter residue codes
  (M141A/M81A/R194A/L198A/S202A/V29A) across filenames, tables, scripts, figures.
- Fix Eaton et al. (2012) gamma2 Ser195 probe characterisation: the modification
  potentiates current under GABA, pentobarbital and etomidate alike; agonist
  specificity is in modification rate, not etomidate exclusion.
- Retract the per-residue hotspot conclusion in sec 4.5 (scan retained as a
  transparency record of single-trajectory MM-GBSA sampling noise).
- JMGM formatting: abstract <=250 words; Highlights <=85 characters each.
- Align DeltaG_solv to the deposited value (19.42 kcal/mol); add a reference-frame
  note to mut_ddg_results.txt; document the radius-of-gyration recipe in README.
- Regenerate MANIFEST; round-4 gate 21/21 PASS.
</commit_message>
<xml_diff>
--- a/manuscript/manuscript.docx
+++ b/manuscript/manuscript.docx
@@ -123,7 +123,7 @@
         <w:t>Background.</w:t>
       </w:r>
       <w:r>
-        <w:t xml:space="preserve"> Postoperative sleep disturbance (PSD) is common after anaesthesia and surgery and is associated with delirium-like behaviour and impaired recovery. </w:t>
+        <w:t xml:space="preserve"> Postoperative sleep disturbance (PSD) is common after anaesthesia. The insomnia herb </w:t>
       </w:r>
       <w:r>
         <w:rPr>
@@ -132,7 +132,7 @@
         <w:t>Ziziphi Spinosae Semen</w:t>
       </w:r>
       <w:r>
-        <w:t xml:space="preserve"> (ZSS, 酸枣仁) is used for insomnia, but its saponins are poorly absorbed and activity resides in metabolites rather than the parent glycosides: jujuboside A has an oral bioavailability of 1.32%, hydrolysis is predominantly gastric, and jujuboside B and jujubogenin, not the parent molecules, are the species reported to modulate GABA</w:t>
+        <w:t xml:space="preserve"> (ZSS) modulates GABA</w:t>
       </w:r>
       <w:r>
         <w:rPr>
@@ -141,16 +141,7 @@
         <w:t>A</w:t>
       </w:r>
       <w:r>
-        <w:t xml:space="preserve"> receptors [1]. Their sleep-promoting action is mediated through GABA</w:t>
-      </w:r>
-      <w:r>
-        <w:rPr>
-          <w:vertAlign w:val="subscript"/>
-        </w:rPr>
-        <w:t>A</w:t>
-      </w:r>
-      <w:r>
-        <w:t>-ergic transmission [2]. Which metabolite engages which site, and whether a docked pose is dynamically stable, has not been addressed computationally for the perioperative setting; engagement of the benzodiazepine (BZ) site has been assumed rather than tested.</w:t>
+        <w:t>, but its site of action is untested: its saponins are poorly absorbed and the aglycone jujubogenin, not the parent glycosides, is the active species. Which site jujubogenin engages is unaddressed computationally.</w:t>
       </w:r>
     </w:p>
     <w:p>
@@ -164,16 +155,7 @@
         <w:t>Objective.</w:t>
       </w:r>
       <w:r>
-        <w:t xml:space="preserve"> To determine </w:t>
-      </w:r>
-      <w:r>
-        <w:rPr>
-          <w:i/>
-        </w:rPr>
-        <w:t>in silico</w:t>
-      </w:r>
-      <w:r>
-        <w:t xml:space="preserve"> which site of the GABA</w:t>
+        <w:t xml:space="preserve"> To determine in silico which GABA</w:t>
       </w:r>
       <w:r>
         <w:rPr>
@@ -182,7 +164,7 @@
         <w:t>A</w:t>
       </w:r>
       <w:r>
-        <w:t xml:space="preserve"> receptor jujubogenin engages, using a docking protocol validated against a crystal standard, and whether the resulting pose is stable under explicit-solvent molecular dynamics.</w:t>
+        <w:t xml:space="preserve"> site jujubogenin engages and whether the resulting pose is dynamically stable.</w:t>
       </w:r>
     </w:p>
     <w:p>
@@ -196,34 +178,7 @@
         <w:t>Methods.</w:t>
       </w:r>
       <w:r>
-        <w:t xml:space="preserve"> Jujubogenin (PubChem CID 15515703) and flumazenil (CID 3373) were docked with AutoDock Vina 1.2.7 at the α1/γ2 interface of the human α1β2γ2 GABA</w:t>
-      </w:r>
-      <w:r>
-        <w:rPr>
-          <w:vertAlign w:val="subscript"/>
-        </w:rPr>
-        <w:t>A</w:t>
-      </w:r>
-      <w:r>
-        <w:t xml:space="preserve"> receptor (PDB 6X3Z; chains D = α1, E = γ2). The protocol was validated against the flumazenil co-crystal (PDB 6X3U): the initial search box proved to be centred 21.5 Å from the crystallographic BZ site, and all docking was repeated with a box centred on that site. The best jujubogenin pose was carried into all-atom molecular dynamics (GROMACS 2024.5; amber99sb-ildn protein, GAFF2 ligand with AM1-BCC charges, TIP3P water, 0.15 M NaCl; dodecahedral box, 1.2 nm clearance; 214,802 atoms) on an RTX 4090 and analysed over </w:t>
-      </w:r>
-      <w:r>
-        <w:rPr>
-          <w:b/>
-        </w:rPr>
-        <w:t>24.8 ns (497 frames)</w:t>
-      </w:r>
-      <w:r>
-        <w:t xml:space="preserve"> with explicit </w:t>
-      </w:r>
-      <w:r>
-        <w:rPr>
-          <w:b/>
-        </w:rPr>
-        <w:t>PBC imaging</w:t>
-      </w:r>
-      <w:r>
-        <w:t xml:space="preserve"> before every metric. Binding free energy was estimated by MM-GBSA and cross-checked against energy-group interaction energies.</w:t>
+        <w:t xml:space="preserve"> Jujubogenin and flumazenil were docked with AutoDock Vina at the α1/γ2 interface of the α1β2γ2 receptor (PDB 6X3Z), validated against the flumazenil co-crystal (6X3U). The best jujubogenin pose entered 24.8 ns explicit-solvent molecular dynamics with PBC imaging; binding free energy was estimated by MM-GBSA.</w:t>
       </w:r>
     </w:p>
     <w:p>
@@ -237,79 +192,7 @@
         <w:t>Results.</w:t>
       </w:r>
       <w:r>
-        <w:t xml:space="preserve"> Under the identical, crystal-validated protocol, flumazenil redocked into the BZ site (−7.086 kcal/mol; contacts α1 HIS102/SER205/VAL203 and γ2 TYR58/PHE77, a subset of the crystal contact set). Jujubogenin scored only </w:t>
-      </w:r>
-      <w:r>
-        <w:rPr>
-          <w:b/>
-        </w:rPr>
-        <w:t>−4.403 kcal/mol at the BZ site</w:t>
-      </w:r>
-      <w:r>
-        <w:t xml:space="preserve"> and did not reproduce the classical BZ contact pattern; an exploratory search outside the BZ box identified a distinct interfacial cavity pose (</w:t>
-      </w:r>
-      <w:r>
-        <w:rPr>
-          <w:b/>
-        </w:rPr>
-        <w:t>−8.324 kcal/mol</w:t>
-      </w:r>
-      <w:r>
-        <w:t xml:space="preserve">) whose 25 simulation contact residues share </w:t>
-      </w:r>
-      <w:r>
-        <w:rPr>
-          <w:b/>
-        </w:rPr>
-        <w:t>no</w:t>
-      </w:r>
-      <w:r>
-        <w:t xml:space="preserve"> residue with the classical BZ set and whose centroid lies 23.1 Å from the BZ-site centroid (the two poses come from different search boxes; see §2.2). In that cavity pose jujubogenin remained stably bound throughout 24.8 ns: ligand heavy-atom RMSD </w:t>
-      </w:r>
-      <w:r>
-        <w:rPr>
-          <w:b/>
-        </w:rPr>
-        <w:t>0.42 ± 0.10 Å (maximum 0.66 Å)</w:t>
-      </w:r>
-      <w:r>
-        <w:t xml:space="preserve">, backbone RMSD </w:t>
-      </w:r>
-      <w:r>
-        <w:rPr>
-          <w:b/>
-        </w:rPr>
-        <w:t>2.36 ± 0.32 Å</w:t>
-      </w:r>
-      <w:r>
-        <w:t xml:space="preserve">, pocket-residue RMSD </w:t>
-      </w:r>
-      <w:r>
-        <w:rPr>
-          <w:b/>
-        </w:rPr>
-        <w:t>1.72 ± 0.21 Å</w:t>
-      </w:r>
-      <w:r>
-        <w:t xml:space="preserve">, ligand–pocket centroid distance steady at </w:t>
-      </w:r>
-      <w:r>
-        <w:rPr>
-          <w:b/>
-        </w:rPr>
-        <w:t>2.086 ± 0.060 nm</w:t>
-      </w:r>
-      <w:r>
-        <w:t xml:space="preserve">; no dissociation was observed. MM-GBSA gave </w:t>
-      </w:r>
-      <w:r>
-        <w:rPr>
-          <w:b/>
-        </w:rPr>
-        <w:t>ΔG = −38.06 ± 2.14 kcal/mol</w:t>
-      </w:r>
-      <w:r>
-        <w:t xml:space="preserve"> (ΔVDWAALS −47.11, ΔEEL −10.37, ΔEGB +24.74, ΔESURF −5.31; no entropy term); a second, differently implemented energy-group interaction energy (−52.86 ± 4.93 kcal/mol, 64.9% from γ2) agrees in its gas-phase components, although the two totals differ by ~15 kcal/mol because the energy-group estimate omits solvation and entropy.</w:t>
+        <w:t xml:space="preserve"> Flumazenil redocked into the benzodiazepine (BZ) site (−7.086 kcal/mol). Jujubogenin scored only −4.403 kcal/mol there and did not reproduce the BZ contacts; an exploratory search found a membrane-proximal α1/γ2 cavity (−8.324 kcal/mol) whose 25 contacts share none with the BZ set. Jujubogenin remained stably bound over 24.8 ns (ligand RMSD 0.42 ± 0.10 Å; backbone RMSD 2.36 ± 0.32 Å). MM-GBSA gave ΔG = −38.06 ± 2.14 kcal/mol (no entropy term).</w:t>
       </w:r>
     </w:p>
     <w:p>
@@ -332,16 +215,7 @@
         <w:t>A</w:t>
       </w:r>
       <w:r>
-        <w:t xml:space="preserve"> benzodiazepine site. An exploratory search identifies a distinct, membrane-proximal cavity at the α1/γ2 interface (a candidate allosteric site) as a stable binding pose over 24.8 ns, but the relative preference between sites is not established by docking and requires a cavity-targeted re-dock for confirmation. All energetics are </w:t>
-      </w:r>
-      <w:r>
-        <w:rPr>
-          <w:b/>
-        </w:rPr>
-        <w:t>computational predictions</w:t>
-      </w:r>
-      <w:r>
-        <w:t>: no affinity, efficacy, direction of modulation, causal, or clinical claim is made, and the functional consequence of binding at this cavity is untested.</w:t>
+        <w:t xml:space="preserve"> benzodiazepine site. A candidate allosteric α1/γ2-interface cavity is a stable, hypothesis-generating pose; site preference is unestablished. All energetics are computational predictions: no affinity, efficacy, functional, or clinical claim is made.</w:t>
       </w:r>
     </w:p>
     <w:p>
@@ -392,16 +266,7 @@
         <w:pStyle w:val="ListBullet"/>
       </w:pPr>
       <w:r>
-        <w:t xml:space="preserve">Under a crystal-validated docking protocol, jujubogenin does </w:t>
-      </w:r>
-      <w:r>
-        <w:rPr>
-          <w:b/>
-        </w:rPr>
-        <w:t>not</w:t>
-      </w:r>
-      <w:r>
-        <w:t xml:space="preserve"> preferentially occupy the GABA</w:t>
+        <w:t>Jujubogenin does not preferentially occupy the GABA</w:t>
       </w:r>
       <w:r>
         <w:rPr>
@@ -410,7 +275,7 @@
         <w:t>A</w:t>
       </w:r>
       <w:r>
-        <w:t xml:space="preserve"> benzodiazepine site.</w:t>
+        <w:t xml:space="preserve"> BZ site.</w:t>
       </w:r>
     </w:p>
     <w:p>
@@ -418,7 +283,7 @@
         <w:pStyle w:val="ListBullet"/>
       </w:pPr>
       <w:r>
-        <w:t>An exploratory search identifies a membrane-proximal cavity at the α1/γ2 interface (25 contact residues, none shared with the benzodiazepine set) that remains stably bound over 24.8 ns of molecular dynamics.</w:t>
+        <w:t>The α1/γ2-interface cavity is a stable, candidate allosteric site.</w:t>
       </w:r>
     </w:p>
     <w:p>
@@ -426,7 +291,7 @@
         <w:pStyle w:val="ListBullet"/>
       </w:pPr>
       <w:r>
-        <w:t>The cavity pose and the BZ-site pose derive from different search boxes, so the relative preference between sites is not established and requires a cavity-targeted re-dock.</w:t>
+        <w:t>The cavity and BZ poses use different boxes; site preference is unestablished.</w:t>
       </w:r>
     </w:p>
     <w:p>
@@ -434,7 +299,7 @@
         <w:pStyle w:val="ListBullet"/>
       </w:pPr>
       <w:r>
-        <w:t>Two computational energetics approaches, differing in their treatment of topology and solvation, give favourable but enthalpic, unconverged estimates; no affinity, efficacy, or functional claim is made.</w:t>
+        <w:t>Two energetics approaches give favourable, unconverged enthalpic estimates.</w:t>
       </w:r>
     </w:p>
     <w:p>
@@ -442,7 +307,7 @@
         <w:pStyle w:val="ListBullet"/>
       </w:pPr>
       <w:r>
-        <w:t>Two easily repeated and easily missed failure modes, namely a mis-centred docking search box and trajectories analysed without periodic-boundary imaging, are documented as methodological cautionary cases.</w:t>
+        <w:t>A mis-centred docking box and un-imaged trajectories are documented failure modes.</w:t>
       </w:r>
     </w:p>
     <w:p>
@@ -2540,7 +2405,7 @@
               <w:rPr>
                 <w:sz w:val="20"/>
               </w:rPr>
-              <w:t>+19.43 ± 0.25</w:t>
+              <w:t>+19.42 ± 0.25</w:t>
             </w:r>
           </w:p>
         </w:tc>
@@ -3236,7 +3101,7 @@
               <w:rPr>
                 <w:sz w:val="20"/>
               </w:rPr>
-              <w:t>D141A</w:t>
+              <w:t>M141A</w:t>
             </w:r>
           </w:p>
         </w:tc>
@@ -3328,7 +3193,7 @@
               <w:rPr>
                 <w:sz w:val="20"/>
               </w:rPr>
-              <w:t>D81A</w:t>
+              <w:t>M81A</w:t>
             </w:r>
           </w:p>
         </w:tc>
@@ -3420,7 +3285,7 @@
               <w:rPr>
                 <w:sz w:val="20"/>
               </w:rPr>
-              <w:t>E194A</w:t>
+              <w:t>R194A</w:t>
             </w:r>
           </w:p>
         </w:tc>
@@ -3512,7 +3377,7 @@
               <w:rPr>
                 <w:sz w:val="20"/>
               </w:rPr>
-              <w:t>E198A</w:t>
+              <w:t>L198A</w:t>
             </w:r>
           </w:p>
         </w:tc>
@@ -3604,7 +3469,7 @@
               <w:rPr>
                 <w:sz w:val="20"/>
               </w:rPr>
-              <w:t>E202A</w:t>
+              <w:t>S202A</w:t>
             </w:r>
           </w:p>
         </w:tc>
@@ -3696,7 +3561,7 @@
               <w:rPr>
                 <w:sz w:val="20"/>
               </w:rPr>
-              <w:t>E29A</w:t>
+              <w:t>V29A</w:t>
             </w:r>
           </w:p>
         </w:tc>
@@ -3813,7 +3678,7 @@
           <w:rFonts w:ascii="Consolas" w:hAnsi="Consolas"/>
           <w:sz w:val="20"/>
         </w:rPr>
-        <w:t>mmpbsa_D141A_rep2.dat</w:t>
+        <w:t>mmpbsa_M141A_rep2.dat</w:t>
       </w:r>
       <w:r>
         <w:t xml:space="preserve"> and </w:t>
@@ -3823,7 +3688,7 @@
           <w:rFonts w:ascii="Consolas" w:hAnsi="Consolas"/>
           <w:sz w:val="20"/>
         </w:rPr>
-        <w:t>mmpbsa_E194A_rep2.dat</w:t>
+        <w:t>mmpbsa_R194A_rep2.dat</w:t>
       </w:r>
       <w:r>
         <w:t xml:space="preserve"> in </w:t>
@@ -3836,7 +3701,7 @@
         <w:t>analysis/scan/rep2/</w:t>
       </w:r>
       <w:r>
-        <w:t xml:space="preserve">, with the corresponding gmx_MMPBSA logs recording the command line and the 100 processed frames) gave ΔΔG of +27.44 ± 5.44 (D141A) and +13.51 ± 6.26 (E194A) kcal/mol, differing from the first-replica estimates by 13.5 and 21.6 kcal/mol respectively. This spread, far larger than the standard deviation </w:t>
+        <w:t xml:space="preserve">, with the corresponding gmx_MMPBSA logs recording the command line and the 100 processed frames) gave ΔΔG of +27.44 ± 5.44 (M141A) and +13.51 ± 6.26 (R194A) kcal/mol, differing from the first-replica estimates by 13.5 and 21.6 kcal/mol respectively. This spread, far larger than the standard deviation </w:t>
       </w:r>
       <w:r>
         <w:rPr>
@@ -3916,7 +3781,7 @@
         <w:t>res</w:t>
       </w:r>
       <w:r>
-        <w:t xml:space="preserve"> changed by &lt; 1 kcal/mol in every case. The cause is the standard MM-GBSA cancellation: an alanine substitution alters the residue's self-energy in both the complex and the isolated receptor by nearly the same amount, so the difference (the binding contribution) cancels toward zero (for D81A and E29A the complex and receptor electrostatic terms were identical to three significant figures, giving ΔG</w:t>
+        <w:t xml:space="preserve"> changed by &lt; 1 kcal/mol in every case. The cause is the standard MM-GBSA cancellation: an alanine substitution alters the residue's self-energy in both the complex and the isolated receptor by nearly the same amount, so the difference (the binding contribution) cancels toward zero (for M81A and V29A the complex and receptor electrostatic terms were identical to three significant figures, giving ΔG</w:t>
       </w:r>
       <w:r>
         <w:rPr>
@@ -3943,7 +3808,7 @@
         <w:t>(3) Non-contact ΔΔG is pseudopositive.</w:t>
       </w:r>
       <w:r>
-        <w:t xml:space="preserve"> D81A and E29A lie well outside the ligand contact distance, so their large positive ΔΔG (+25.36 and +22.65 kcal/mol) cannot arise from lost contact and are identified as sampling artefacts, setting a pseudopositive floor of roughly +23 to +25 kcal/mol for this design. Against that floor only γ2 ARG194 (+35.11) and γ2 LEU198 (+33.16) rise clearly above it; γ2 SER202 (+23.24) is marginal, sitting above the lower control but below the upper one, and α1 MET141 (+13.98) falls below both controls, at 2.9 times its own propagated standard deviation. The scan therefore supports a directional signal at the two γ2 hotspots and does not support one at α1 MET141; this is a consistency check, not a quantitative attribution.</w:t>
+        <w:t xml:space="preserve"> M81A and V29A lie well outside the ligand contact distance, so their large positive ΔΔG (+25.36 and +22.65 kcal/mol) cannot arise from lost contact and are identified as sampling artefacts, setting a pseudopositive floor of roughly +23 to +25 kcal/mol for this design. Against that floor only γ2 ARG194 (+35.11) and γ2 LEU198 (+33.16) rise clearly above it; γ2 SER202 (+23.24) is marginal, sitting above the lower control but below the upper one, and α1 MET141 (+13.98) falls below both controls, at 2.9 times its own propagated standard deviation. No residue-level hotspot conclusion is defensible from this scan. The only doubly sampled residue, R194A, flips across the pseudopositive floor between replicas (+35.11 in replica 1 versus +13.51 in replica 2), and the per-residue decomposition shows the ΔΔG is dominated by non-contact-attributable sampling error rather than a lost specific contact. The scan is therefore retained only as a transparency exercise documenting the magnitude of single-trajectory MM-GBSA sampling noise, not as evidence for a particular contact residue.</w:t>
       </w:r>
     </w:p>
     <w:p>
@@ -4018,7 +3883,7 @@
           <w:rFonts w:ascii="Consolas" w:hAnsi="Consolas"/>
           <w:sz w:val="20"/>
         </w:rPr>
-        <w:t>analysis/scan/rep2/mmpbsa_D141A_rep2.dat</w:t>
+        <w:t>analysis/scan/rep2/mmpbsa_M141A_rep2.dat</w:t>
       </w:r>
       <w:r>
         <w:t xml:space="preserve"> and </w:t>
@@ -4028,7 +3893,7 @@
           <w:rFonts w:ascii="Consolas" w:hAnsi="Consolas"/>
           <w:sz w:val="20"/>
         </w:rPr>
-        <w:t>mmpbsa_E194A_rep2.dat</w:t>
+        <w:t>mmpbsa_R194A_rep2.dat</w:t>
       </w:r>
       <w:r>
         <w:t xml:space="preserve">, and the wild-type reference used in this table (ΔG = −38.06 ± 2.14 kcal/mol, 0–24.8 ns window) by the deposited </w:t>
@@ -4158,7 +4023,7 @@
         <w:t>One point of convergence with experiment is encouraging but not confirmatory.</w:t>
       </w:r>
       <w:r>
-        <w:t xml:space="preserve"> γ2 Ser195, which the present MD identifies as a cavity-contact residue (§3.1), is the same position that Eaton et al. [17] used as a substituted-cysteine (loop F) probe of the α1/γ2 interface: modification of γ2(S195C) potentiated GABA-gated but not etomidate-gated current, indicating that this interface region transmits agonist-specific conformational change. That the candidate cavity contacts a residue already known to report on α1/γ2 interfacial motion is a useful cross-check. It is not proof of binding, because the experimental probe sits in the extracellular domain whereas the present cavity model spans the ECD–TMD junction, and the overlap is at the level of a single shared residue.</w:t>
+        <w:t xml:space="preserve"> γ2 Ser195, which the present MD identifies as a cavity-contact residue (§3.1), is the same position that Eaton et al. [17] used as a substituted-cysteine (loop F) probe of the α1/γ2 interface: modification of γ2(S195C) potentiated current in the presence of GABA, pentobarbital and etomidate, the agonist-specific signal being the rate of modification (etomidate modified faster than pentobarbital, gabazine or the resting state), indicating that this interface region transmits agonist-specific conformational change. That the candidate cavity contacts a residue already known to report on α1/γ2 interfacial motion is a useful cross-check. It is not proof of binding, because the experimental probe sits in the extracellular domain whereas the present cavity model spans the ECD–TMD junction, and the overlap is at the level of a single shared residue.</w:t>
       </w:r>
     </w:p>
     <w:p>
@@ -4415,7 +4280,7 @@
         <w:rPr>
           <w:sz w:val="20"/>
         </w:rPr>
-        <w:t xml:space="preserve">Figure 3. In-silico alanine scan of the cavity hotspots (§4.5). Bars show ΔΔG relative to the wild-type reference (WT ΔG = −38.06 ± 2.14 kcal/mol, the 0–24.8 ns window whose MM-GBSA output is deposited; the 30–50 ns window, whose output is deposited as well, would shift every bar by the same −5.66 kcal/mol); error bars are standard deviations propagated from the mutant and wild-type estimates (single 20 ns replica). Blue bars: planned contact-shell hotspots; red bars: non-contact controls (α1 MET81, γ2 VAL29), whose pseudopositive ΔΔG defines the shaded sampling-artefact floor; only the two γ2 hotspots (E194A, E198A) rise clearly above that floor. Diamonds: independently seeded replicas of D141A (+27.44 ± 5.44 kcal/mol) and E194A (+13.51 ± 6.26 kcal/mol), both backed by retained outputs in </w:t>
+        <w:t xml:space="preserve">Figure 3. In-silico alanine scan of the cavity hotspots (§4.5). Bars show ΔΔG relative to the wild-type reference (WT ΔG = −38.06 ± 2.14 kcal/mol, the 0–24.8 ns window whose MM-GBSA output is deposited; the 30–50 ns window, whose output is deposited as well, would shift every bar by the same −5.66 kcal/mol); error bars are standard deviations propagated from the mutant and wild-type estimates (single 20 ns replica). Blue bars: planned contact-shell hotspots; red bars: non-contact controls (α1 MET81, γ2 VAL29), whose pseudopositive ΔΔG defines the shaded sampling-artefact floor; only the two γ2 hotspots (R194A, L198A) rise clearly above that floor. Diamonds: independently seeded replicas of M141A (+27.44 ± 5.44 kcal/mol) and R194A (+13.51 ± 6.26 kcal/mol), both backed by retained outputs in </w:t>
       </w:r>
       <w:r>
         <w:rPr>
@@ -4468,7 +4333,7 @@
         <w:t>Data availability.</w:t>
       </w:r>
       <w:r>
-        <w:t xml:space="preserve"> The full reproducibility package is deposited in the author's public repository at https://github.com/yyx-4113/ziziphi-jujubogenin-gabaA-insilico (tag v1.0.9), which contains the analysis code, input structures, and all derived products required to reproduce every reported value. The repository is organized as: </w:t>
+        <w:t xml:space="preserve"> The full reproducibility package is deposited in the author's public repository at https://github.com/yyx-4113/ziziphi-jujubogenin-gabaA-insilico (tag v1.0.10), which contains the analysis code, input structures, and all derived products required to reproduce every reported value. The repository is organized as: </w:t>
       </w:r>
       <w:r>
         <w:rPr>

</xml_diff>

<commit_message>
Release v1.0.11 -- Round 5 independent expert-review revisions
- Correct the DeltaDeltaG re-referencing sign in README: the 30-50 ns window
  shifts every DeltaDeltaG by -5.66 kcal/mol (not +5.66).
- Add the '(membrane-absent model)' caveat to the title (manuscript, README,
  CITATION) for honesty about the two-chain aqueous interface model.
- Soften residual 'hotspot' wording in section 4.5 and Fig. 3 to 'residues',
  consistent with the section 4.5 retraction that no residue-level hotspot
  conclusion is defensible from the scan.
- Bump the Data-availability repository tag to v1.0.11.
- Track the six tleap-built mutant starting coordinates
  (analysis/scan/rep1/complex_*.gro) and SHA-256 list them in MANIFEST; add
  .gitattributes + regenerate_manifest.py so MANIFEST SHAs are stable across
  machines (LF-normalized).
- Regenerate manuscript.docx.
</commit_message>
<xml_diff>
--- a/manuscript/manuscript.docx
+++ b/manuscript/manuscript.docx
@@ -27,7 +27,7 @@
           <w:b/>
           <w:sz w:val="30"/>
         </w:rPr>
-        <w:t xml:space="preserve"> benzodiazepine site: an in silico study of a candidate allosteric cavity at the α1/γ2 interface</w:t>
+        <w:t xml:space="preserve"> benzodiazepine site: an in silico study of a candidate allosteric cavity at the α1/γ2 interface (membrane-absent model)</w:t>
       </w:r>
     </w:p>
     <w:p>
@@ -3930,7 +3930,7 @@
         <w:t>Computational and experimental steps still required.</w:t>
       </w:r>
       <w:r>
-        <w:t xml:space="preserve"> The remaining two computational tests are unchanged in design. A membrane-embedded full-pentamer simulation (α1β2γ2 with all four transmembrane segments in lipid) would test whether the cavity survives in a physiological geometry, which the present two-chain aqueous model cannot address. Replicate trajectories and the 100 ns extension now in progress would test whether the pose survives independent sampling rather than resting on a single trajectory, and longer sampling would support a proper entropy estimate. The directional signal at the two γ2 hotspots from the scan above should be extended rather than taken as quantitative: an expanded scan that includes γ2 ARG232 and ARG197, and that reports ΔΔG as a mean ± range across replicas, would convert the present directional ranking into a more defensible specificity claim. Beyond computation, the decisive tests are experimental and lie outside this study's scope: contact-residue mutagenesis with an electrophysiological readout (GABA concentration–response on α1β2γ2 wild-type and mutants, looking for a shift in EC</w:t>
+        <w:t xml:space="preserve"> The remaining two computational tests are unchanged in design. A membrane-embedded full-pentamer simulation (α1β2γ2 with all four transmembrane segments in lipid) would test whether the cavity survives in a physiological geometry, which the present two-chain aqueous model cannot address. Replicate trajectories and the 100 ns extension now in progress would test whether the pose survives independent sampling rather than resting on a single trajectory, and longer sampling would support a proper entropy estimate. The directional signal at the two γ2 residues (ARG194, LEU198) from the scan above should be extended rather than taken as quantitative: an expanded scan that includes γ2 ARG232 and ARG197, and that reports ΔΔG as a mean ± range across replicas, would convert the present directional ranking into a more defensible specificity claim. Beyond computation, the decisive tests are experimental and lie outside this study's scope: contact-residue mutagenesis with an electrophysiological readout (GABA concentration–response on α1β2γ2 wild-type and mutants, looking for a shift in EC</w:t>
       </w:r>
       <w:r>
         <w:rPr>
@@ -4280,7 +4280,7 @@
         <w:rPr>
           <w:sz w:val="20"/>
         </w:rPr>
-        <w:t xml:space="preserve">Figure 3. In-silico alanine scan of the cavity hotspots (§4.5). Bars show ΔΔG relative to the wild-type reference (WT ΔG = −38.06 ± 2.14 kcal/mol, the 0–24.8 ns window whose MM-GBSA output is deposited; the 30–50 ns window, whose output is deposited as well, would shift every bar by the same −5.66 kcal/mol); error bars are standard deviations propagated from the mutant and wild-type estimates (single 20 ns replica). Blue bars: planned contact-shell hotspots; red bars: non-contact controls (α1 MET81, γ2 VAL29), whose pseudopositive ΔΔG defines the shaded sampling-artefact floor; only the two γ2 hotspots (R194A, L198A) rise clearly above that floor. Diamonds: independently seeded replicas of M141A (+27.44 ± 5.44 kcal/mol) and R194A (+13.51 ± 6.26 kcal/mol), both backed by retained outputs in </w:t>
+        <w:t xml:space="preserve">Figure 3. In-silico alanine scan of the cavity hotspots (§4.5). Bars show ΔΔG relative to the wild-type reference (WT ΔG = −38.06 ± 2.14 kcal/mol, the 0–24.8 ns window whose MM-GBSA output is deposited; the 30–50 ns window, whose output is deposited as well, would shift every bar by the same −5.66 kcal/mol); error bars are standard deviations propagated from the mutant and wild-type estimates (single 20 ns replica). Blue bars: planned contact-shell hotspots; red bars: non-contact controls (α1 MET81, γ2 VAL29), whose pseudopositive ΔΔG defines the shaded sampling-artefact floor; only the two γ2 residues (R194A, L198A) rise clearly above that floor. Diamonds: independently seeded replicas of M141A (+27.44 ± 5.44 kcal/mol) and R194A (+13.51 ± 6.26 kcal/mol), both backed by retained outputs in </w:t>
       </w:r>
       <w:r>
         <w:rPr>
@@ -4333,7 +4333,7 @@
         <w:t>Data availability.</w:t>
       </w:r>
       <w:r>
-        <w:t xml:space="preserve"> The full reproducibility package is deposited in the author's public repository at https://github.com/yyx-4113/ziziphi-jujubogenin-gabaA-insilico (tag v1.0.10), which contains the analysis code, input structures, and all derived products required to reproduce every reported value. The repository is organized as: </w:t>
+        <w:t xml:space="preserve"> The full reproducibility package is deposited in the author's public repository at https://github.com/yyx-4113/ziziphi-jujubogenin-gabaA-insilico (tag v1.0.11), which contains the analysis code, input structures, and all derived products required to reproduce every reported value. The repository is organized as: </w:t>
       </w:r>
       <w:r>
         <w:rPr>

</xml_diff>